<commit_message>
Added codes for Smart Grid
</commit_message>
<xml_diff>
--- a/Documents/Padwekar_Shraddha_LitReview.docx
+++ b/Documents/Padwekar_Shraddha_LitReview.docx
@@ -184,7 +184,25 @@
               <w:sz w:val="32"/>
               <w:szCs w:val="32"/>
             </w:rPr>
-            <w:t xml:space="preserve">Shraddha Padwekar </w:t>
+            <w:t xml:space="preserve">Shraddha </w:t>
+          </w:r>
+          <w:proofErr w:type="spellStart"/>
+          <w:r>
+            <w:rPr>
+              <w:spacing w:val="15"/>
+              <w:sz w:val="32"/>
+              <w:szCs w:val="32"/>
+            </w:rPr>
+            <w:t>Padwekar</w:t>
+          </w:r>
+          <w:proofErr w:type="spellEnd"/>
+          <w:r>
+            <w:rPr>
+              <w:spacing w:val="15"/>
+              <w:sz w:val="32"/>
+              <w:szCs w:val="32"/>
+            </w:rPr>
+            <w:t xml:space="preserve"> </w:t>
           </w:r>
         </w:p>
         <w:p>
@@ -337,7 +355,7 @@
           <w:r>
             <w:fldChar w:fldCharType="separate"/>
           </w:r>
-          <w:hyperlink w:anchor="_Toc201619676" w:history="1">
+          <w:hyperlink w:anchor="_Toc202469741" w:history="1">
             <w:r>
               <w:rPr>
                 <w:rStyle w:val="Hyperlink"/>
@@ -364,7 +382,7 @@
                 <w:noProof/>
                 <w:webHidden/>
               </w:rPr>
-              <w:instrText xml:space="preserve"> PAGEREF _Toc201619676 \h </w:instrText>
+              <w:instrText xml:space="preserve"> PAGEREF _Toc202469741 \h </w:instrText>
             </w:r>
             <w:r>
               <w:rPr>
@@ -384,7 +402,7 @@
                 <w:noProof/>
                 <w:webHidden/>
               </w:rPr>
-              <w:t>2</w:t>
+              <w:t>3</w:t>
             </w:r>
             <w:r>
               <w:rPr>
@@ -412,7 +430,7 @@
               <w14:ligatures w14:val="standardContextual"/>
             </w:rPr>
           </w:pPr>
-          <w:hyperlink w:anchor="_Toc201619677" w:history="1">
+          <w:hyperlink w:anchor="_Toc202469742" w:history="1">
             <w:r>
               <w:rPr>
                 <w:rStyle w:val="Hyperlink"/>
@@ -459,7 +477,7 @@
                 <w:noProof/>
                 <w:webHidden/>
               </w:rPr>
-              <w:instrText xml:space="preserve"> PAGEREF _Toc201619677 \h </w:instrText>
+              <w:instrText xml:space="preserve"> PAGEREF _Toc202469742 \h </w:instrText>
             </w:r>
             <w:r>
               <w:rPr>
@@ -507,7 +525,7 @@
               <w14:ligatures w14:val="standardContextual"/>
             </w:rPr>
           </w:pPr>
-          <w:hyperlink w:anchor="_Toc201619678" w:history="1">
+          <w:hyperlink w:anchor="_Toc202469743" w:history="1">
             <w:r>
               <w:rPr>
                 <w:rStyle w:val="Hyperlink"/>
@@ -554,7 +572,7 @@
                 <w:noProof/>
                 <w:webHidden/>
               </w:rPr>
-              <w:instrText xml:space="preserve"> PAGEREF _Toc201619678 \h </w:instrText>
+              <w:instrText xml:space="preserve"> PAGEREF _Toc202469743 \h </w:instrText>
             </w:r>
             <w:r>
               <w:rPr>
@@ -602,7 +620,7 @@
               <w14:ligatures w14:val="standardContextual"/>
             </w:rPr>
           </w:pPr>
-          <w:hyperlink w:anchor="_Toc201619679" w:history="1">
+          <w:hyperlink w:anchor="_Toc202469744" w:history="1">
             <w:r>
               <w:rPr>
                 <w:rStyle w:val="Hyperlink"/>
@@ -649,7 +667,7 @@
                 <w:noProof/>
                 <w:webHidden/>
               </w:rPr>
-              <w:instrText xml:space="preserve"> PAGEREF _Toc201619679 \h </w:instrText>
+              <w:instrText xml:space="preserve"> PAGEREF _Toc202469744 \h </w:instrText>
             </w:r>
             <w:r>
               <w:rPr>
@@ -697,7 +715,7 @@
               <w14:ligatures w14:val="standardContextual"/>
             </w:rPr>
           </w:pPr>
-          <w:hyperlink w:anchor="_Toc201619680" w:history="1">
+          <w:hyperlink w:anchor="_Toc202469745" w:history="1">
             <w:r>
               <w:rPr>
                 <w:rStyle w:val="Hyperlink"/>
@@ -744,7 +762,7 @@
                 <w:noProof/>
                 <w:webHidden/>
               </w:rPr>
-              <w:instrText xml:space="preserve"> PAGEREF _Toc201619680 \h </w:instrText>
+              <w:instrText xml:space="preserve"> PAGEREF _Toc202469745 \h </w:instrText>
             </w:r>
             <w:r>
               <w:rPr>
@@ -789,13 +807,13 @@
               <w14:ligatures w14:val="standardContextual"/>
             </w:rPr>
           </w:pPr>
-          <w:hyperlink w:anchor="_Toc201619681" w:history="1">
+          <w:hyperlink w:anchor="_Toc202469746" w:history="1">
             <w:r>
               <w:rPr>
                 <w:rStyle w:val="Hyperlink"/>
                 <w:noProof/>
               </w:rPr>
-              <w:t>5. Demand Variability and Load Clustering</w:t>
+              <w:t>5.    Demand Variability and Load Clustering</w:t>
             </w:r>
             <w:r>
               <w:rPr>
@@ -816,7 +834,7 @@
                 <w:noProof/>
                 <w:webHidden/>
               </w:rPr>
-              <w:instrText xml:space="preserve"> PAGEREF _Toc201619681 \h </w:instrText>
+              <w:instrText xml:space="preserve"> PAGEREF _Toc202469746 \h </w:instrText>
             </w:r>
             <w:r>
               <w:rPr>
@@ -861,13 +879,13 @@
               <w14:ligatures w14:val="standardContextual"/>
             </w:rPr>
           </w:pPr>
-          <w:hyperlink w:anchor="_Toc201619682" w:history="1">
+          <w:hyperlink w:anchor="_Toc202469747" w:history="1">
             <w:r>
               <w:rPr>
                 <w:rStyle w:val="Hyperlink"/>
                 <w:noProof/>
               </w:rPr>
-              <w:t>6. Price Volatility and Dispatch Deviation</w:t>
+              <w:t>6.    Price Volatility and Dispatch Deviation</w:t>
             </w:r>
             <w:r>
               <w:rPr>
@@ -888,7 +906,7 @@
                 <w:noProof/>
                 <w:webHidden/>
               </w:rPr>
-              <w:instrText xml:space="preserve"> PAGEREF _Toc201619682 \h </w:instrText>
+              <w:instrText xml:space="preserve"> PAGEREF _Toc202469747 \h </w:instrText>
             </w:r>
             <w:r>
               <w:rPr>
@@ -933,13 +951,13 @@
               <w14:ligatures w14:val="standardContextual"/>
             </w:rPr>
           </w:pPr>
-          <w:hyperlink w:anchor="_Toc201619683" w:history="1">
+          <w:hyperlink w:anchor="_Toc202469748" w:history="1">
             <w:r>
               <w:rPr>
                 <w:rStyle w:val="Hyperlink"/>
                 <w:noProof/>
               </w:rPr>
-              <w:t>7. Outage Resilience and Grid Infrastructure</w:t>
+              <w:t>7.    Outage Resilience and Grid Infrastructure</w:t>
             </w:r>
             <w:r>
               <w:rPr>
@@ -960,7 +978,7 @@
                 <w:noProof/>
                 <w:webHidden/>
               </w:rPr>
-              <w:instrText xml:space="preserve"> PAGEREF _Toc201619683 \h </w:instrText>
+              <w:instrText xml:space="preserve"> PAGEREF _Toc202469748 \h </w:instrText>
             </w:r>
             <w:r>
               <w:rPr>
@@ -1005,13 +1023,13 @@
               <w14:ligatures w14:val="standardContextual"/>
             </w:rPr>
           </w:pPr>
-          <w:hyperlink w:anchor="_Toc201619684" w:history="1">
+          <w:hyperlink w:anchor="_Toc202469749" w:history="1">
             <w:r>
               <w:rPr>
                 <w:rStyle w:val="Hyperlink"/>
                 <w:noProof/>
               </w:rPr>
-              <w:t>8. Cross-Cutting Methodologies and Enabling Technologies</w:t>
+              <w:t>8.    Cross-Cutting Methodologies and Enabling Technologies</w:t>
             </w:r>
             <w:r>
               <w:rPr>
@@ -1032,7 +1050,7 @@
                 <w:noProof/>
                 <w:webHidden/>
               </w:rPr>
-              <w:instrText xml:space="preserve"> PAGEREF _Toc201619684 \h </w:instrText>
+              <w:instrText xml:space="preserve"> PAGEREF _Toc202469749 \h </w:instrText>
             </w:r>
             <w:r>
               <w:rPr>
@@ -1077,13 +1095,13 @@
               <w14:ligatures w14:val="standardContextual"/>
             </w:rPr>
           </w:pPr>
-          <w:hyperlink w:anchor="_Toc201619685" w:history="1">
+          <w:hyperlink w:anchor="_Toc202469750" w:history="1">
             <w:r>
               <w:rPr>
                 <w:rStyle w:val="Hyperlink"/>
                 <w:noProof/>
               </w:rPr>
-              <w:t>9. Data Description</w:t>
+              <w:t>9.    Data Description</w:t>
             </w:r>
             <w:r>
               <w:rPr>
@@ -1104,7 +1122,7 @@
                 <w:noProof/>
                 <w:webHidden/>
               </w:rPr>
-              <w:instrText xml:space="preserve"> PAGEREF _Toc201619685 \h </w:instrText>
+              <w:instrText xml:space="preserve"> PAGEREF _Toc202469750 \h </w:instrText>
             </w:r>
             <w:r>
               <w:rPr>
@@ -1149,13 +1167,13 @@
               <w14:ligatures w14:val="standardContextual"/>
             </w:rPr>
           </w:pPr>
-          <w:hyperlink w:anchor="_Toc201619686" w:history="1">
+          <w:hyperlink w:anchor="_Toc202469751" w:history="1">
             <w:r>
               <w:rPr>
                 <w:rStyle w:val="Hyperlink"/>
                 <w:noProof/>
               </w:rPr>
-              <w:t>10. Literature Summary</w:t>
+              <w:t>10.  Literature Summary</w:t>
             </w:r>
             <w:r>
               <w:rPr>
@@ -1176,7 +1194,7 @@
                 <w:noProof/>
                 <w:webHidden/>
               </w:rPr>
-              <w:instrText xml:space="preserve"> PAGEREF _Toc201619686 \h </w:instrText>
+              <w:instrText xml:space="preserve"> PAGEREF _Toc202469751 \h </w:instrText>
             </w:r>
             <w:r>
               <w:rPr>
@@ -1221,13 +1239,13 @@
               <w14:ligatures w14:val="standardContextual"/>
             </w:rPr>
           </w:pPr>
-          <w:hyperlink w:anchor="_Toc201619687" w:history="1">
+          <w:hyperlink w:anchor="_Toc202469752" w:history="1">
             <w:r>
               <w:rPr>
                 <w:rStyle w:val="Hyperlink"/>
                 <w:noProof/>
               </w:rPr>
-              <w:t>11. Precautions and Limitations</w:t>
+              <w:t>11.   Precautions and Limitations</w:t>
             </w:r>
             <w:r>
               <w:rPr>
@@ -1248,7 +1266,7 @@
                 <w:noProof/>
                 <w:webHidden/>
               </w:rPr>
-              <w:instrText xml:space="preserve"> PAGEREF _Toc201619687 \h </w:instrText>
+              <w:instrText xml:space="preserve"> PAGEREF _Toc202469752 \h </w:instrText>
             </w:r>
             <w:r>
               <w:rPr>
@@ -1269,101 +1287,6 @@
                 <w:webHidden/>
               </w:rPr>
               <w:t>20</w:t>
-            </w:r>
-            <w:r>
-              <w:rPr>
-                <w:noProof/>
-                <w:webHidden/>
-              </w:rPr>
-              <w:fldChar w:fldCharType="end"/>
-            </w:r>
-          </w:hyperlink>
-        </w:p>
-        <w:p>
-          <w:pPr>
-            <w:pStyle w:val="TOC1"/>
-            <w:tabs>
-              <w:tab w:val="left" w:pos="660"/>
-            </w:tabs>
-            <w:rPr>
-              <w:rFonts w:asciiTheme="minorHAnsi" w:eastAsiaTheme="minorEastAsia" w:hAnsiTheme="minorHAnsi" w:cstheme="minorBidi"/>
-              <w:b w:val="0"/>
-              <w:noProof/>
-              <w:color w:val="auto"/>
-              <w:kern w:val="2"/>
-              <w:szCs w:val="24"/>
-              <w:lang w:eastAsia="en-CA"/>
-              <w14:ligatures w14:val="standardContextual"/>
-            </w:rPr>
-          </w:pPr>
-          <w:hyperlink w:anchor="_Toc201619688" w:history="1">
-            <w:r>
-              <w:rPr>
-                <w:rStyle w:val="Hyperlink"/>
-                <w:noProof/>
-              </w:rPr>
-              <w:t>12.</w:t>
-            </w:r>
-            <w:r>
-              <w:rPr>
-                <w:rFonts w:asciiTheme="minorHAnsi" w:eastAsiaTheme="minorEastAsia" w:hAnsiTheme="minorHAnsi" w:cstheme="minorBidi"/>
-                <w:b w:val="0"/>
-                <w:noProof/>
-                <w:color w:val="auto"/>
-                <w:kern w:val="2"/>
-                <w:szCs w:val="24"/>
-                <w:lang w:eastAsia="en-CA"/>
-                <w14:ligatures w14:val="standardContextual"/>
-              </w:rPr>
-              <w:tab/>
-            </w:r>
-            <w:r>
-              <w:rPr>
-                <w:rStyle w:val="Hyperlink"/>
-                <w:noProof/>
-              </w:rPr>
-              <w:t>Significance and Future Work</w:t>
-            </w:r>
-            <w:r>
-              <w:rPr>
-                <w:noProof/>
-                <w:webHidden/>
-              </w:rPr>
-              <w:tab/>
-            </w:r>
-            <w:r>
-              <w:rPr>
-                <w:noProof/>
-                <w:webHidden/>
-              </w:rPr>
-              <w:fldChar w:fldCharType="begin"/>
-            </w:r>
-            <w:r>
-              <w:rPr>
-                <w:noProof/>
-                <w:webHidden/>
-              </w:rPr>
-              <w:instrText xml:space="preserve"> PAGEREF _Toc201619688 \h </w:instrText>
-            </w:r>
-            <w:r>
-              <w:rPr>
-                <w:noProof/>
-                <w:webHidden/>
-              </w:rPr>
-            </w:r>
-            <w:r>
-              <w:rPr>
-                <w:noProof/>
-                <w:webHidden/>
-              </w:rPr>
-              <w:fldChar w:fldCharType="separate"/>
-            </w:r>
-            <w:r>
-              <w:rPr>
-                <w:noProof/>
-                <w:webHidden/>
-              </w:rPr>
-              <w:t>21</w:t>
             </w:r>
             <w:r>
               <w:rPr>
@@ -1388,13 +1311,13 @@
               <w14:ligatures w14:val="standardContextual"/>
             </w:rPr>
           </w:pPr>
-          <w:hyperlink w:anchor="_Toc201619689" w:history="1">
+          <w:hyperlink w:anchor="_Toc202469753" w:history="1">
             <w:r>
               <w:rPr>
                 <w:rStyle w:val="Hyperlink"/>
                 <w:noProof/>
               </w:rPr>
-              <w:t>References</w:t>
+              <w:t>12.  Significance and Future Work</w:t>
             </w:r>
             <w:r>
               <w:rPr>
@@ -1415,7 +1338,79 @@
                 <w:noProof/>
                 <w:webHidden/>
               </w:rPr>
-              <w:instrText xml:space="preserve"> PAGEREF _Toc201619689 \h </w:instrText>
+              <w:instrText xml:space="preserve"> PAGEREF _Toc202469753 \h </w:instrText>
+            </w:r>
+            <w:r>
+              <w:rPr>
+                <w:noProof/>
+                <w:webHidden/>
+              </w:rPr>
+            </w:r>
+            <w:r>
+              <w:rPr>
+                <w:noProof/>
+                <w:webHidden/>
+              </w:rPr>
+              <w:fldChar w:fldCharType="separate"/>
+            </w:r>
+            <w:r>
+              <w:rPr>
+                <w:noProof/>
+                <w:webHidden/>
+              </w:rPr>
+              <w:t>21</w:t>
+            </w:r>
+            <w:r>
+              <w:rPr>
+                <w:noProof/>
+                <w:webHidden/>
+              </w:rPr>
+              <w:fldChar w:fldCharType="end"/>
+            </w:r>
+          </w:hyperlink>
+        </w:p>
+        <w:p>
+          <w:pPr>
+            <w:pStyle w:val="TOC1"/>
+            <w:rPr>
+              <w:rFonts w:asciiTheme="minorHAnsi" w:eastAsiaTheme="minorEastAsia" w:hAnsiTheme="minorHAnsi" w:cstheme="minorBidi"/>
+              <w:b w:val="0"/>
+              <w:noProof/>
+              <w:color w:val="auto"/>
+              <w:kern w:val="2"/>
+              <w:szCs w:val="24"/>
+              <w:lang w:eastAsia="en-CA"/>
+              <w14:ligatures w14:val="standardContextual"/>
+            </w:rPr>
+          </w:pPr>
+          <w:hyperlink w:anchor="_Toc202469754" w:history="1">
+            <w:r>
+              <w:rPr>
+                <w:rStyle w:val="Hyperlink"/>
+                <w:noProof/>
+              </w:rPr>
+              <w:t>13.    References</w:t>
+            </w:r>
+            <w:r>
+              <w:rPr>
+                <w:noProof/>
+                <w:webHidden/>
+              </w:rPr>
+              <w:tab/>
+            </w:r>
+            <w:r>
+              <w:rPr>
+                <w:noProof/>
+                <w:webHidden/>
+              </w:rPr>
+              <w:fldChar w:fldCharType="begin"/>
+            </w:r>
+            <w:r>
+              <w:rPr>
+                <w:noProof/>
+                <w:webHidden/>
+              </w:rPr>
+              <w:instrText xml:space="preserve"> PAGEREF _Toc202469754 \h </w:instrText>
             </w:r>
             <w:r>
               <w:rPr>
@@ -1476,7 +1471,7 @@
       <w:pPr>
         <w:pStyle w:val="Heading1"/>
       </w:pPr>
-      <w:bookmarkStart w:id="0" w:name="_Toc201619676"/>
+      <w:bookmarkStart w:id="0" w:name="_Toc202469741"/>
       <w:r>
         <w:lastRenderedPageBreak/>
         <w:t>Abstract</w:t>
@@ -1490,7 +1485,15 @@
     </w:p>
     <w:p>
       <w:r>
-        <w:t>Keywords: Smart Grid Readiness, Demand Variability, Price Volatility, Grid Resilience, On- tario Electricity Zones</w:t>
+        <w:t xml:space="preserve">Keywords: Smart Grid Readiness, Demand Variability, Price Volatility, Grid Resilience, On- </w:t>
+      </w:r>
+      <w:proofErr w:type="spellStart"/>
+      <w:r>
+        <w:t>tario</w:t>
+      </w:r>
+      <w:proofErr w:type="spellEnd"/>
+      <w:r>
+        <w:t xml:space="preserve"> Electricity Zones</w:t>
       </w:r>
     </w:p>
     <w:p>
@@ -1505,12 +1508,28 @@
         <w:t xml:space="preserve"> </w:t>
       </w:r>
       <w:hyperlink r:id="rId9" w:history="1">
+        <w:proofErr w:type="spellStart"/>
         <w:r>
           <w:rPr>
             <w:rStyle w:val="Hyperlink"/>
           </w:rPr>
-          <w:t>ShraddhaPadwekar/DataScience_SmartGridInvestmentZones</w:t>
+          <w:t>ShraddhaPadwekar</w:t>
         </w:r>
+        <w:proofErr w:type="spellEnd"/>
+        <w:r>
+          <w:rPr>
+            <w:rStyle w:val="Hyperlink"/>
+          </w:rPr>
+          <w:t>/</w:t>
+        </w:r>
+        <w:proofErr w:type="spellStart"/>
+        <w:r>
+          <w:rPr>
+            <w:rStyle w:val="Hyperlink"/>
+          </w:rPr>
+          <w:t>DataScience_SmartGridInvestmentZones</w:t>
+        </w:r>
+        <w:proofErr w:type="spellEnd"/>
       </w:hyperlink>
     </w:p>
     <w:p/>
@@ -1518,7 +1537,7 @@
       <w:pPr>
         <w:pStyle w:val="Heading1"/>
       </w:pPr>
-      <w:bookmarkStart w:id="1" w:name="_Toc201619677"/>
+      <w:bookmarkStart w:id="1" w:name="_Toc202469742"/>
       <w:r>
         <w:t>1.</w:t>
       </w:r>
@@ -1530,7 +1549,23 @@
     </w:p>
     <w:p>
       <w:r>
-        <w:t>This research project investigates the readiness of Ontario’s zonal electricity system to support smart grid integration. Conducted as part of an academic capstone, the study aims to develop a Smart Grid Readiness Index (SGRI) that quantifies operational stress and infrastructure volatil- ity across different regions of the province. The project is motivated by Ontario’s diverse grid conditions, market structures, and evolving energy transition goals.</w:t>
+        <w:t xml:space="preserve">This research project investigates the readiness of Ontario’s zonal electricity system to support smart grid integration. Conducted as part of an academic capstone, the study aims to develop a Smart Grid Readiness Index (SGRI) that quantifies operational stress and infrastructure </w:t>
+      </w:r>
+      <w:proofErr w:type="spellStart"/>
+      <w:r>
+        <w:t>volatil</w:t>
+      </w:r>
+      <w:proofErr w:type="spellEnd"/>
+      <w:r>
+        <w:t xml:space="preserve">- </w:t>
+      </w:r>
+      <w:proofErr w:type="spellStart"/>
+      <w:r>
+        <w:t>ity</w:t>
+      </w:r>
+      <w:proofErr w:type="spellEnd"/>
+      <w:r>
+        <w:t xml:space="preserve"> across different regions of the province. The project is motivated by Ontario’s diverse grid conditions, market structures, and evolving energy transition goals.</w:t>
       </w:r>
     </w:p>
     <w:p>
@@ -1563,7 +1598,7 @@
       <w:pPr>
         <w:pStyle w:val="Heading1"/>
       </w:pPr>
-      <w:bookmarkStart w:id="2" w:name="_Toc201619678"/>
+      <w:bookmarkStart w:id="2" w:name="_Toc202469743"/>
       <w:r>
         <w:t>2.</w:t>
       </w:r>
@@ -1585,12 +1620,44 @@
     </w:p>
     <w:p>
       <w:r>
-        <w:t>Which Ontario electricity zones exhibit the greatest operational stress and infrastruc- ture volatility, and how can a composite Smart Grid Readiness Index guide strategic investment prioritization?</w:t>
-      </w:r>
-    </w:p>
-    <w:p>
-      <w:r>
-        <w:t>To address this question, the study decomposes the problem into three analytical subcompo- nents:</w:t>
+        <w:t xml:space="preserve">Which Ontario electricity zones exhibit the greatest operational stress and </w:t>
+      </w:r>
+      <w:proofErr w:type="spellStart"/>
+      <w:r>
+        <w:t>infrastruc</w:t>
+      </w:r>
+      <w:proofErr w:type="spellEnd"/>
+      <w:r>
+        <w:t xml:space="preserve">- </w:t>
+      </w:r>
+      <w:proofErr w:type="spellStart"/>
+      <w:r>
+        <w:t>ture</w:t>
+      </w:r>
+      <w:proofErr w:type="spellEnd"/>
+      <w:r>
+        <w:t xml:space="preserve"> volatility, and how can a composite Smart Grid Readiness Index guide strategic investment prioritization?</w:t>
+      </w:r>
+    </w:p>
+    <w:p>
+      <w:r>
+        <w:t xml:space="preserve">To address this question, the study decomposes the problem into three analytical </w:t>
+      </w:r>
+      <w:proofErr w:type="spellStart"/>
+      <w:r>
+        <w:t>subcompo</w:t>
+      </w:r>
+      <w:proofErr w:type="spellEnd"/>
+      <w:r>
+        <w:t xml:space="preserve">- </w:t>
+      </w:r>
+      <w:proofErr w:type="spellStart"/>
+      <w:r>
+        <w:t>nents</w:t>
+      </w:r>
+      <w:proofErr w:type="spellEnd"/>
+      <w:r>
+        <w:t>:</w:t>
       </w:r>
     </w:p>
     <w:p>
@@ -1671,7 +1738,15 @@
         <w:t xml:space="preserve">Transmission Outage and Infrastructure Resilience: </w:t>
       </w:r>
       <w:r>
-        <w:t>Measure the frequency and dura- tion of outages in relation to grid performance indicators to evaluate physical infrastructure reliability.</w:t>
+        <w:t xml:space="preserve">Measure the frequency and dura- </w:t>
+      </w:r>
+      <w:proofErr w:type="spellStart"/>
+      <w:r>
+        <w:t>tion</w:t>
+      </w:r>
+      <w:proofErr w:type="spellEnd"/>
+      <w:r>
+        <w:t xml:space="preserve"> of outages in relation to grid performance indicators to evaluate physical infrastructure reliability.</w:t>
       </w:r>
     </w:p>
     <w:p>
@@ -1684,7 +1759,7 @@
       <w:pPr>
         <w:pStyle w:val="Heading1"/>
       </w:pPr>
-      <w:bookmarkStart w:id="3" w:name="_Toc201619679"/>
+      <w:bookmarkStart w:id="3" w:name="_Toc202469744"/>
       <w:r>
         <w:t>3.</w:t>
       </w:r>
@@ -1696,7 +1771,15 @@
     </w:p>
     <w:p>
       <w:r>
-        <w:t xml:space="preserve">A comprehensive review of existing literature is essential to establish the theoretical and method- ological foundation for constructing the Smart Grid Readiness Index (SGRI). The </w:t>
+        <w:t xml:space="preserve">A comprehensive review of existing literature is essential to establish the theoretical and method- </w:t>
+      </w:r>
+      <w:proofErr w:type="spellStart"/>
+      <w:r>
+        <w:t>ological</w:t>
+      </w:r>
+      <w:proofErr w:type="spellEnd"/>
+      <w:r>
+        <w:t xml:space="preserve"> foundation for constructing the Smart Grid Readiness Index (SGRI). The </w:t>
       </w:r>
       <w:r>
         <w:lastRenderedPageBreak/>
@@ -1788,7 +1871,15 @@
         <w:t>Price Volatility and Dispatch Deviation:</w:t>
       </w:r>
       <w:r>
-        <w:t xml:space="preserve"> Several studies explore electricity price fore- casting under uncertainty [13, 10], demand response mechanisms, and price feedback insta- bility [9]. These works inform the design of control-aware volatility metrics and dispatch deviation indicators.</w:t>
+        <w:t xml:space="preserve"> Several studies explore electricity price fore- casting under uncertainty [13, 10], demand response mechanisms, and price feedback insta- </w:t>
+      </w:r>
+      <w:proofErr w:type="spellStart"/>
+      <w:r>
+        <w:t>bility</w:t>
+      </w:r>
+      <w:proofErr w:type="spellEnd"/>
+      <w:r>
+        <w:t xml:space="preserve"> [9]. These works inform the design of control-aware volatility metrics and dispatch deviation indicators.</w:t>
       </w:r>
     </w:p>
     <w:p>
@@ -1853,7 +1944,7 @@
       <w:pPr>
         <w:pStyle w:val="Heading1"/>
       </w:pPr>
-      <w:bookmarkStart w:id="4" w:name="_Toc201619680"/>
+      <w:bookmarkStart w:id="4" w:name="_Toc202469745"/>
       <w:r>
         <w:t>4.</w:t>
       </w:r>
@@ -1894,13 +1985,181 @@
     </w:p>
     <w:p>
       <w:r>
+        <w:lastRenderedPageBreak/>
         <w:t>Grid modernization requires not only technological innovation but also a systematic, data-driven understanding of how and where to allocate infrastructure investments. The concept of Smart Grid Readiness (SGR) offers a structured framework for assessing the extent to which electricity systems are prepared to integrate advanced capabilities such as automation, distributed generation, demand response, and digital control. This domain includes literature that introduces composite readiness indices, multicriteria planning models, and policy-aligned strategies for prioritizing smart grid development at national, regional, and zonal levels.</w:t>
       </w:r>
     </w:p>
     <w:p>
       <w:r>
+        <w:t xml:space="preserve">In the context of Ontario’s zonal electricity system, readiness varies considerably across regions due to differences in infrastructure age, load profiles, renewable integration, and historical invest- </w:t>
+      </w:r>
+      <w:proofErr w:type="spellStart"/>
+      <w:r>
+        <w:t>ment</w:t>
+      </w:r>
+      <w:proofErr w:type="spellEnd"/>
+      <w:r>
+        <w:t>. Recent studies emphasize the importance of targeted evaluation approaches that reflect these disparities. Such evaluations enable decision-makers to identify areas of strategic importance, direct capital effectively, and ensure that readiness assessments support both reliability goals and climate-aligned modernization strategies.</w:t>
+      </w:r>
+    </w:p>
+    <w:p/>
+    <w:p>
+      <w:pPr>
+        <w:rPr>
+          <w:b/>
+          <w:bCs/>
+        </w:rPr>
+      </w:pPr>
+      <w:r>
+        <w:rPr>
+          <w:b/>
+          <w:bCs/>
+        </w:rPr>
+        <w:t>4.2.</w:t>
+      </w:r>
+      <w:r>
+        <w:rPr>
+          <w:b/>
+          <w:bCs/>
+        </w:rPr>
+        <w:t xml:space="preserve"> </w:t>
+      </w:r>
+      <w:r>
+        <w:rPr>
+          <w:b/>
+          <w:bCs/>
+        </w:rPr>
+        <w:t>Representative Literature in the Domain</w:t>
+      </w:r>
+    </w:p>
+    <w:p>
+      <w:r>
+        <w:t>1.Natural Resources Canada, Smart Grid in Canada 2020–2021, Government of Canada, 2021.</w:t>
+      </w:r>
+    </w:p>
+    <w:p>
+      <w:r>
+        <w:t>2.</w:t>
+      </w:r>
+      <w:r>
+        <w:t xml:space="preserve"> </w:t>
+      </w:r>
+      <w:r>
+        <w:t>IESO, “IESO-GIF Projects Evaluation Report 2024,” Independent Electricity System Operator, 2024.</w:t>
+      </w:r>
+    </w:p>
+    <w:p>
+      <w:r>
+        <w:t>3.</w:t>
+      </w:r>
+      <w:r>
+        <w:t xml:space="preserve"> </w:t>
+      </w:r>
+      <w:r>
+        <w:t>M. Cinelli et al., “Multicriteria Support for the Evaluation of Electricity Supply,” Renewable and Sustainable Energy Reviews, vol. 157, 2022.</w:t>
+      </w:r>
+    </w:p>
+    <w:p>
+      <w:r>
+        <w:t>4.</w:t>
+      </w:r>
+      <w:r>
+        <w:t xml:space="preserve"> </w:t>
+      </w:r>
+      <w:r>
+        <w:t xml:space="preserve">M.G.M. </w:t>
+      </w:r>
+      <w:proofErr w:type="spellStart"/>
+      <w:r>
+        <w:t>Almihat</w:t>
+      </w:r>
+      <w:proofErr w:type="spellEnd"/>
+      <w:r>
+        <w:t xml:space="preserve"> and J.L. Munda, “The Role of Smart Grid Technologies in Urban and Sustainable Energy Planning,” Energies, vol. 18, 2025, Art. no. 1618.</w:t>
+      </w:r>
+    </w:p>
+    <w:p>
+      <w:r>
+        <w:t>5.</w:t>
+      </w:r>
+      <w:r>
+        <w:t xml:space="preserve"> </w:t>
+      </w:r>
+      <w:r>
+        <w:t>G.B. Gaggero et al., “A Possible Smart Metering System Evolution for Rural and Remote Areas Employing UAVs and IoT in Smart Grids,” Sensors, vol. 21, no. 5, 2021.</w:t>
+      </w:r>
+    </w:p>
+    <w:p/>
+    <w:p>
+      <w:pPr>
+        <w:rPr>
+          <w:b/>
+          <w:bCs/>
+        </w:rPr>
+      </w:pPr>
+      <w:r>
+        <w:rPr>
+          <w:b/>
+          <w:bCs/>
+        </w:rPr>
+        <w:t>4.3.</w:t>
+      </w:r>
+      <w:r>
+        <w:rPr>
+          <w:b/>
+          <w:bCs/>
+        </w:rPr>
+        <w:t xml:space="preserve"> </w:t>
+      </w:r>
+      <w:r>
+        <w:rPr>
+          <w:b/>
+          <w:bCs/>
+        </w:rPr>
+        <w:t>Comparative Analysis and Thematic Insights</w:t>
+      </w:r>
+    </w:p>
+    <w:p>
+      <w:r>
+        <w:t xml:space="preserve">Natural Resources Canada’s national report on smart grid deployment [1] outlines regional trends in grid modernization, automation, and digitalization. It highlights significant disparities in invest- </w:t>
+      </w:r>
+      <w:proofErr w:type="spellStart"/>
+      <w:r>
+        <w:t>ment</w:t>
+      </w:r>
+      <w:proofErr w:type="spellEnd"/>
+      <w:r>
+        <w:t xml:space="preserve"> levels and technological adoption across provinces, making a case for more localized readiness assessments. However, the report does not provide zonal-level granularity or performance-based indicators necessary for sub-provincial evaluation.</w:t>
+      </w:r>
+    </w:p>
+    <w:p>
+      <w:r>
+        <w:t xml:space="preserve">The IESO-GIF report [2] evaluates over 80 innovation pilot projects across Ontario. It cate- </w:t>
+      </w:r>
+      <w:proofErr w:type="spellStart"/>
+      <w:r>
+        <w:t>gorizes</w:t>
+      </w:r>
+      <w:proofErr w:type="spellEnd"/>
+      <w:r>
+        <w:t xml:space="preserve"> efforts in distributed energy resources (DERs), energy storage, microgrids, and </w:t>
+      </w:r>
+      <w:r>
         <w:lastRenderedPageBreak/>
-        <w:t>In the context of Ontario’s zonal electricity system, readiness varies considerably across regions due to differences in infrastructure age, load profiles, renewable integration, and historical invest- ment. Recent studies emphasize the importance of targeted evaluation approaches that reflect these disparities. Such evaluations enable decision-makers to identify areas of strategic importance, direct capital effectively, and ensure that readiness assessments support both reliability goals and climate-aligned modernization strategies.</w:t>
+        <w:t>advanced analytics. By geotagging project deployment, the report enables identification of zones with limited exposure to smart grid innovation—especially in northern and rural Ontario. This data is well- suited to serve as an empirical basis for scoring technological readiness and investment density.</w:t>
+      </w:r>
+    </w:p>
+    <w:p>
+      <w:r>
+        <w:t xml:space="preserve">Cinelli et al. [3] present a decision-analytic framework to evaluate electricity supply systems using technical, economic, social, and environmental criteria. Their multicriteria approach supports the construction of composite indices like the Smart Grid Readiness Index (SGRI) proposed in this study. </w:t>
+      </w:r>
+      <w:proofErr w:type="spellStart"/>
+      <w:r>
+        <w:t>Almihat</w:t>
+      </w:r>
+      <w:proofErr w:type="spellEnd"/>
+      <w:r>
+        <w:t xml:space="preserve"> and Munda [4] further expand on this concept by incorporating sustainability and urban development goals, thereby providing guidance on linking grid modernization with long-term regional planning objectives.</w:t>
       </w:r>
     </w:p>
     <w:p/>
@@ -1916,134 +2175,6 @@
           <w:b/>
           <w:bCs/>
         </w:rPr>
-        <w:t>4.2.</w:t>
-      </w:r>
-      <w:r>
-        <w:rPr>
-          <w:b/>
-          <w:bCs/>
-        </w:rPr>
-        <w:t xml:space="preserve"> </w:t>
-      </w:r>
-      <w:r>
-        <w:rPr>
-          <w:b/>
-          <w:bCs/>
-        </w:rPr>
-        <w:t>Representative Literature in the Domain</w:t>
-      </w:r>
-    </w:p>
-    <w:p>
-      <w:r>
-        <w:t>1.Natural Resources Canada, Smart Grid in Canada 2020–2021, Government of Canada, 2021.</w:t>
-      </w:r>
-    </w:p>
-    <w:p>
-      <w:r>
-        <w:t>2.</w:t>
-      </w:r>
-      <w:r>
-        <w:t xml:space="preserve"> </w:t>
-      </w:r>
-      <w:r>
-        <w:t>IESO, “IESO-GIF Projects Evaluation Report 2024,” Independent Electricity System Operator, 2024.</w:t>
-      </w:r>
-    </w:p>
-    <w:p>
-      <w:r>
-        <w:t>3.</w:t>
-      </w:r>
-      <w:r>
-        <w:t xml:space="preserve"> </w:t>
-      </w:r>
-      <w:r>
-        <w:t>M. Cinelli et al., “Multicriteria Support for the Evaluation of Electricity Supply,” Renewable and Sustainable Energy Reviews, vol. 157, 2022.</w:t>
-      </w:r>
-    </w:p>
-    <w:p>
-      <w:r>
-        <w:t>4.</w:t>
-      </w:r>
-      <w:r>
-        <w:t xml:space="preserve"> </w:t>
-      </w:r>
-      <w:r>
-        <w:t>M.G.M. Almihat and J.L. Munda, “The Role of Smart Grid Technologies in Urban and Sustainable Energy Planning,” Energies, vol. 18, 2025, Art. no. 1618.</w:t>
-      </w:r>
-    </w:p>
-    <w:p>
-      <w:r>
-        <w:t>5.</w:t>
-      </w:r>
-      <w:r>
-        <w:t xml:space="preserve"> </w:t>
-      </w:r>
-      <w:r>
-        <w:t>G.B. Gaggero et al., “A Possible Smart Metering System Evolution for Rural and Remote Areas Employing UAVs and IoT in Smart Grids,” Sensors, vol. 21, no. 5, 2021.</w:t>
-      </w:r>
-    </w:p>
-    <w:p/>
-    <w:p>
-      <w:pPr>
-        <w:rPr>
-          <w:b/>
-          <w:bCs/>
-        </w:rPr>
-      </w:pPr>
-      <w:r>
-        <w:rPr>
-          <w:b/>
-          <w:bCs/>
-        </w:rPr>
-        <w:t>4.3.</w:t>
-      </w:r>
-      <w:r>
-        <w:rPr>
-          <w:b/>
-          <w:bCs/>
-        </w:rPr>
-        <w:t xml:space="preserve"> </w:t>
-      </w:r>
-      <w:r>
-        <w:rPr>
-          <w:b/>
-          <w:bCs/>
-        </w:rPr>
-        <w:t>Comparative Analysis and Thematic Insights</w:t>
-      </w:r>
-    </w:p>
-    <w:p>
-      <w:r>
-        <w:t>Natural Resources Canada’s national report on smart grid deployment [1] outlines regional trends in grid modernization, automation, and digitalization. It highlights significant disparities in invest- ment levels and technological adoption across provinces, making a case for more localized readiness assessments. However, the report does not provide zonal-level granularity or performance-based indicators necessary for sub-provincial evaluation.</w:t>
-      </w:r>
-    </w:p>
-    <w:p>
-      <w:r>
-        <w:t>The IESO-GIF report [2] evaluates over 80 innovation pilot projects across Ontario. It cate- gorizes efforts in distributed energy resources (DERs), energy storage, microgrids, and advanced analytics. By geotagging project deployment, the report enables identification of zones with limited exposure to smart grid innovation—especially in northern and rural Ontario. This data is well- suited to serve as an empirical basis for scoring technological readiness and investment density.</w:t>
-      </w:r>
-    </w:p>
-    <w:p>
-      <w:r>
-        <w:t xml:space="preserve">Cinelli et al. [3] present a decision-analytic framework to evaluate electricity supply systems using technical, economic, social, and environmental criteria. Their multicriteria approach supports the construction of composite indices like the Smart Grid Readiness Index (SGRI) </w:t>
-      </w:r>
-      <w:r>
-        <w:lastRenderedPageBreak/>
-        <w:t>proposed in this study. Almihat and Munda [4] further expand on this concept by incorporating sustainability and urban development goals, thereby providing guidance on linking grid modernization with long-term regional planning objectives.</w:t>
-      </w:r>
-    </w:p>
-    <w:p/>
-    <w:p>
-      <w:pPr>
-        <w:rPr>
-          <w:b/>
-          <w:bCs/>
-        </w:rPr>
-      </w:pPr>
-      <w:r>
-        <w:rPr>
-          <w:b/>
-          <w:bCs/>
-        </w:rPr>
         <w:t>4.4.</w:t>
       </w:r>
       <w:r>
@@ -2111,7 +2242,15 @@
         <w:t xml:space="preserve"> </w:t>
       </w:r>
       <w:r>
-        <w:t>Outputs: Zone-wise proxy score indicating whether current infrastructure adequacy is pro- portionate to demand levels.</w:t>
+        <w:t xml:space="preserve">Outputs: Zone-wise proxy score indicating whether current infrastructure adequacy is pro- </w:t>
+      </w:r>
+      <w:proofErr w:type="spellStart"/>
+      <w:r>
+        <w:t>portionate</w:t>
+      </w:r>
+      <w:proofErr w:type="spellEnd"/>
+      <w:r>
+        <w:t xml:space="preserve"> to demand levels.</w:t>
       </w:r>
     </w:p>
     <w:p>
@@ -2137,7 +2276,23 @@
         <w:t xml:space="preserve"> </w:t>
       </w:r>
       <w:r>
-        <w:t>Inputs: Demand variability (from Dataset 1), price volatility (from Dataset 2), outage fre- quency (from Dataset 4), generator output variability (from Dataset 6)</w:t>
+        <w:t xml:space="preserve">Inputs: Demand variability (from Dataset 1), price volatility (from Dataset 2), outage </w:t>
+      </w:r>
+      <w:proofErr w:type="spellStart"/>
+      <w:r>
+        <w:t>fre</w:t>
+      </w:r>
+      <w:proofErr w:type="spellEnd"/>
+      <w:r>
+        <w:t xml:space="preserve">- </w:t>
+      </w:r>
+      <w:proofErr w:type="spellStart"/>
+      <w:r>
+        <w:t>quency</w:t>
+      </w:r>
+      <w:proofErr w:type="spellEnd"/>
+      <w:r>
+        <w:t xml:space="preserve"> (from Dataset 4), generator output variability (from Dataset 6)</w:t>
       </w:r>
     </w:p>
     <w:p>
@@ -2186,341 +2341,6 @@
       </w:r>
       <w:r>
         <w:t>Inputs: Demand variability (Dataset 1), adequacy metrics (Dataset 5), outage frequency (Dataset 4)</w:t>
-      </w:r>
-    </w:p>
-    <w:p>
-      <w:r>
-        <w:t>•</w:t>
-      </w:r>
-      <w:r>
-        <w:t xml:space="preserve"> </w:t>
-      </w:r>
-      <w:r>
-        <w:t>Processing Objective: Identify zones with high operational stress (e.g., high demand vari- ability, frequent outages) but lower adequacy margins.</w:t>
-      </w:r>
-    </w:p>
-    <w:p>
-      <w:r>
-        <w:t>•</w:t>
-      </w:r>
-      <w:r>
-        <w:t xml:space="preserve"> </w:t>
-      </w:r>
-      <w:r>
-        <w:t>Outputs: Map of zones with potential investment gaps based on operational stress and adequacy.</w:t>
-      </w:r>
-    </w:p>
-    <w:p>
-      <w:r>
-        <w:lastRenderedPageBreak/>
-        <w:t>These experiments are designed to operationalize investment prioritization logic using real- world, high-resolution data from the listed IESO datasets, supporting policy-relevant insights about where future smart grid upgrades should be targeted.</w:t>
-      </w:r>
-    </w:p>
-    <w:p/>
-    <w:p>
-      <w:pPr>
-        <w:rPr>
-          <w:b/>
-          <w:bCs/>
-        </w:rPr>
-      </w:pPr>
-      <w:r>
-        <w:rPr>
-          <w:b/>
-          <w:bCs/>
-        </w:rPr>
-        <w:t>4.5.</w:t>
-      </w:r>
-      <w:r>
-        <w:rPr>
-          <w:b/>
-          <w:bCs/>
-        </w:rPr>
-        <w:t xml:space="preserve"> </w:t>
-      </w:r>
-      <w:r>
-        <w:rPr>
-          <w:b/>
-          <w:bCs/>
-        </w:rPr>
-        <w:t>Implications for Smart Grid Readiness Assessment</w:t>
-      </w:r>
-    </w:p>
-    <w:p>
-      <w:r>
-        <w:t>The reviewed literature provides the conceptual and methodological basis for constructing a trans- parent, reproducible Smart Grid Readiness Index tailored to Ontario’s zonal electricity structure. It underscores the importance of aligning readiness assessment with both historical investment patterns and current operational challenges. The integration of MCDM frameworks, pilot project evaluations, and sustainability-driven planning tools ensures that the index supports both infras- tructure modernization and strategic resource allocation. These insights position the SGRI as a decision-support tool for utilities, regulators, and policymakers committed to equitable and effective grid transformation.</w:t>
-      </w:r>
-    </w:p>
-    <w:p/>
-    <w:p>
-      <w:pPr>
-        <w:pStyle w:val="Heading1"/>
-      </w:pPr>
-      <w:bookmarkStart w:id="5" w:name="_Toc201619681"/>
-      <w:r>
-        <w:t>5.</w:t>
-      </w:r>
-      <w:r>
-        <w:t xml:space="preserve"> </w:t>
-      </w:r>
-      <w:r>
-        <w:t>Demand Variability and Load Clustering</w:t>
-      </w:r>
-      <w:bookmarkEnd w:id="5"/>
-    </w:p>
-    <w:p>
-      <w:pPr>
-        <w:rPr>
-          <w:b/>
-          <w:bCs/>
-        </w:rPr>
-      </w:pPr>
-      <w:r>
-        <w:rPr>
-          <w:b/>
-          <w:bCs/>
-        </w:rPr>
-        <w:t>5.1.</w:t>
-      </w:r>
-      <w:r>
-        <w:rPr>
-          <w:b/>
-          <w:bCs/>
-        </w:rPr>
-        <w:t xml:space="preserve"> </w:t>
-      </w:r>
-      <w:r>
-        <w:rPr>
-          <w:b/>
-          <w:bCs/>
-        </w:rPr>
-        <w:t>Context and Scope of the Domain</w:t>
-      </w:r>
-    </w:p>
-    <w:p>
-      <w:r>
-        <w:t xml:space="preserve">Demand-side dynamics play a crucial role in assessing the operational stress experienced by </w:t>
-      </w:r>
-      <w:r>
-        <w:t>electricity</w:t>
-      </w:r>
-      <w:r>
-        <w:t xml:space="preserve"> zones. Variability in energy consumption</w:t>
-      </w:r>
-      <w:r>
-        <w:t xml:space="preserve"> </w:t>
-      </w:r>
-      <w:r>
-        <w:t>both within a day and across multiple days</w:t>
-      </w:r>
-      <w:r>
-        <w:t xml:space="preserve"> </w:t>
-      </w:r>
-      <w:r>
-        <w:t>can increase the complexity of dispatch decisions, elevate the risk of congestion, and reduce the efficiency of generation scheduling. As such, understanding patterns of demand fluctuation is fundamental to evaluating the readiness of a zone to accommodate smart grid technologies that rely on load predictability and responsiveness.</w:t>
-      </w:r>
-    </w:p>
-    <w:p>
-      <w:r>
-        <w:t>In recent years, the availability of granular smart meter data has enabled advanced load analytics at zonal and customer levels. Researchers have applied clustering, time series decomposition, and dimensionality reduction techniques to classify load profiles and identify volatile or peaky patterns. These techniques help isolate zones where traditional supply-following strategies may no longer be sufficient, thereby informing infrastructure upgrades and adaptive control strategies central to smart grid deployment.</w:t>
-      </w:r>
-    </w:p>
-    <w:p/>
-    <w:p>
-      <w:pPr>
-        <w:rPr>
-          <w:b/>
-          <w:bCs/>
-        </w:rPr>
-      </w:pPr>
-      <w:r>
-        <w:rPr>
-          <w:b/>
-          <w:bCs/>
-        </w:rPr>
-        <w:t>5.2.</w:t>
-      </w:r>
-      <w:r>
-        <w:rPr>
-          <w:b/>
-          <w:bCs/>
-        </w:rPr>
-        <w:t xml:space="preserve"> </w:t>
-      </w:r>
-      <w:r>
-        <w:rPr>
-          <w:b/>
-          <w:bCs/>
-        </w:rPr>
-        <w:t>Representative Literature in the Domain</w:t>
-      </w:r>
-    </w:p>
-    <w:p>
-      <w:r>
-        <w:t>1.</w:t>
-      </w:r>
-      <w:r>
-        <w:t xml:space="preserve"> </w:t>
-      </w:r>
-      <w:r>
-        <w:t>J. Kwac, J. Flora, and R. Rajagopal, “Household load pattern clustering using smart meter data,” ACM SIGKDD Explorations Newsletter, vol. 15, no. 2, pp. 56–65, 2014.</w:t>
-      </w:r>
-    </w:p>
-    <w:p>
-      <w:r>
-        <w:lastRenderedPageBreak/>
-        <w:t>2.</w:t>
-      </w:r>
-      <w:r>
-        <w:t xml:space="preserve"> </w:t>
-      </w:r>
-      <w:r>
-        <w:t>M. Qadrdan, M. Chaudry, J. Wu, and N. Jenkins, “Load aggregation and response strategies for demand side management,” Energy, vol. 71, pp. 441–449, 2014.</w:t>
-      </w:r>
-    </w:p>
-    <w:p>
-      <w:r>
-        <w:t>3.</w:t>
-      </w:r>
-      <w:r>
-        <w:t xml:space="preserve"> </w:t>
-      </w:r>
-      <w:r>
-        <w:t>M. Jamei, K. Mylonas, and R. Tindemans, “Electricity demand forecasting at local level using clustering and PAA,” Energy and Built Environment, vol. 1, no. 2, pp. 178–186, 2020.</w:t>
-      </w:r>
-    </w:p>
-    <w:p>
-      <w:r>
-        <w:t>4.</w:t>
-      </w:r>
-      <w:r>
-        <w:t xml:space="preserve"> </w:t>
-      </w:r>
-      <w:r>
-        <w:t>G.B. Gaggero et al., “A Possible Smart Metering System Evolution for Rural and Remote Areas Employing UAVs and IoT in Smart Grids,” Sensors, vol. 21, no. 5, 2021.</w:t>
-      </w:r>
-    </w:p>
-    <w:p>
-      <w:r>
-        <w:t>5.</w:t>
-      </w:r>
-      <w:r>
-        <w:t xml:space="preserve"> </w:t>
-      </w:r>
-      <w:r>
-        <w:t>M. Roozbehani, M.A. Dahleh, and S.K. Mitter, “Volatility of Power Grids Under Real-Time Pricing,” IEEE Trans. Power Syst., vol. 27, no. 4, pp. 1926–1937, 2012.</w:t>
-      </w:r>
-    </w:p>
-    <w:p/>
-    <w:p>
-      <w:pPr>
-        <w:rPr>
-          <w:b/>
-          <w:bCs/>
-        </w:rPr>
-      </w:pPr>
-      <w:r>
-        <w:rPr>
-          <w:b/>
-          <w:bCs/>
-        </w:rPr>
-        <w:t>5.3.</w:t>
-      </w:r>
-      <w:r>
-        <w:rPr>
-          <w:b/>
-          <w:bCs/>
-        </w:rPr>
-        <w:t xml:space="preserve"> </w:t>
-      </w:r>
-      <w:r>
-        <w:rPr>
-          <w:b/>
-          <w:bCs/>
-        </w:rPr>
-        <w:t>Comparative Analysis and Thematic Insights</w:t>
-      </w:r>
-    </w:p>
-    <w:p>
-      <w:r>
-        <w:t>Kwac et al. [6] demonstrate the use of k-means clustering on smart meter data to identify households with similar consumption profiles, revealing that demand diversity can significantly affect system- level planning. Their approach serves as a foundation for identifying zones with erratic or highly synchronized demand, which may pose risks under demand-side management programs.</w:t>
-      </w:r>
-    </w:p>
-    <w:p>
-      <w:r>
-        <w:t>Jamei et al. [8] introduce a lightweight demand forecasting method using Piecewise Aggregate Approximation (PAA) and symbolic approximation to reduce data dimensionality. Their work shows how local demand profiles can be effectively compressed and forecasted even in the absence of real-time updates</w:t>
-      </w:r>
-      <w:r>
-        <w:t xml:space="preserve"> </w:t>
-      </w:r>
-      <w:r>
-        <w:t>an insight particularly useful for evaluating readiness in under-instrumented zones.</w:t>
-      </w:r>
-    </w:p>
-    <w:p>
-      <w:r>
-        <w:t>Gaggero et al. [5] propose a metering architecture suitable for rural and remote areas where real-time data is unavailable. This architecture could enhance demand observability and support clustering in data-scarce Ontario zones. Meanwhile, Qadrdan et al. [7] emphasize how aggregated load profiles can support peak shaving and load shifting strategies, which are central to enabling smart grid responsiveness.</w:t>
-      </w:r>
-    </w:p>
-    <w:p/>
-    <w:p>
-      <w:pPr>
-        <w:rPr>
-          <w:b/>
-          <w:bCs/>
-        </w:rPr>
-      </w:pPr>
-      <w:r>
-        <w:rPr>
-          <w:b/>
-          <w:bCs/>
-        </w:rPr>
-        <w:t>5.4.</w:t>
-      </w:r>
-      <w:r>
-        <w:rPr>
-          <w:b/>
-          <w:bCs/>
-        </w:rPr>
-        <w:t xml:space="preserve"> </w:t>
-      </w:r>
-      <w:r>
-        <w:rPr>
-          <w:b/>
-          <w:bCs/>
-        </w:rPr>
-        <w:t>Experimental Relevance and Data Application Strategy</w:t>
-      </w:r>
-    </w:p>
-    <w:p>
-      <w:r>
-        <w:t>To quantify demand-related stress and variability in Ontario’s zones, the following experiments are proposed: To quantify demand-related stress and variability in Ontario’s zones, the following experiments are proposed using the available IESO datasets:</w:t>
-      </w:r>
-    </w:p>
-    <w:p>
-      <w:pPr>
-        <w:rPr>
-          <w:b/>
-          <w:bCs/>
-        </w:rPr>
-      </w:pPr>
-      <w:r>
-        <w:rPr>
-          <w:b/>
-          <w:bCs/>
-        </w:rPr>
-        <w:t>Experiment 1: Intra-Day and Inter-Day Demand Variability Assessment</w:t>
-      </w:r>
-    </w:p>
-    <w:p>
-      <w:r>
-        <w:t>•</w:t>
-      </w:r>
-      <w:r>
-        <w:t xml:space="preserve"> </w:t>
-      </w:r>
-      <w:r>
-        <w:t>Inputs: Dataset 1 (Real Time Zonal Demand)</w:t>
       </w:r>
     </w:p>
     <w:p>
@@ -2532,6 +2352,422 @@
         <w:t xml:space="preserve"> </w:t>
       </w:r>
       <w:r>
+        <w:t xml:space="preserve">Processing Objective: Identify zones with high operational stress (e.g., high demand </w:t>
+      </w:r>
+      <w:proofErr w:type="spellStart"/>
+      <w:r>
+        <w:t>vari</w:t>
+      </w:r>
+      <w:proofErr w:type="spellEnd"/>
+      <w:r>
+        <w:t>- ability, frequent outages) but lower adequacy margins.</w:t>
+      </w:r>
+    </w:p>
+    <w:p>
+      <w:r>
+        <w:t>•</w:t>
+      </w:r>
+      <w:r>
+        <w:t xml:space="preserve"> </w:t>
+      </w:r>
+      <w:r>
+        <w:t>Outputs: Map of zones with potential investment gaps based on operational stress and adequacy.</w:t>
+      </w:r>
+    </w:p>
+    <w:p>
+      <w:r>
+        <w:t>These experiments are designed to operationalize investment prioritization logic using real- world, high-resolution data from the listed IESO datasets, supporting policy-relevant insights about where future smart grid upgrades should be targeted.</w:t>
+      </w:r>
+    </w:p>
+    <w:p/>
+    <w:p>
+      <w:pPr>
+        <w:rPr>
+          <w:b/>
+          <w:bCs/>
+        </w:rPr>
+      </w:pPr>
+      <w:r>
+        <w:rPr>
+          <w:b/>
+          <w:bCs/>
+        </w:rPr>
+        <w:t>4.5.</w:t>
+      </w:r>
+      <w:r>
+        <w:rPr>
+          <w:b/>
+          <w:bCs/>
+        </w:rPr>
+        <w:t xml:space="preserve"> </w:t>
+      </w:r>
+      <w:r>
+        <w:rPr>
+          <w:b/>
+          <w:bCs/>
+        </w:rPr>
+        <w:t>Implications for Smart Grid Readiness Assessment</w:t>
+      </w:r>
+    </w:p>
+    <w:p>
+      <w:r>
+        <w:t xml:space="preserve">The reviewed literature provides the conceptual and methodological basis for constructing a trans- parent, reproducible Smart Grid Readiness Index tailored to Ontario’s zonal electricity structure. It underscores the importance of aligning readiness assessment with both historical investment patterns and current operational challenges. The integration of MCDM frameworks, pilot project evaluations, and sustainability-driven planning tools ensures that the index supports both </w:t>
+      </w:r>
+      <w:proofErr w:type="spellStart"/>
+      <w:r>
+        <w:t>infras</w:t>
+      </w:r>
+      <w:proofErr w:type="spellEnd"/>
+      <w:r>
+        <w:t xml:space="preserve">- </w:t>
+      </w:r>
+      <w:proofErr w:type="spellStart"/>
+      <w:r>
+        <w:t>tructure</w:t>
+      </w:r>
+      <w:proofErr w:type="spellEnd"/>
+      <w:r>
+        <w:t xml:space="preserve"> modernization and strategic resource allocation. These insights position the SGRI as a decision-support tool for utilities, regulators, and policymakers committed to equitable and effective grid transformation.</w:t>
+      </w:r>
+    </w:p>
+    <w:p/>
+    <w:p>
+      <w:pPr>
+        <w:pStyle w:val="Heading1"/>
+      </w:pPr>
+      <w:bookmarkStart w:id="5" w:name="_Toc202469746"/>
+      <w:r>
+        <w:t>5.</w:t>
+      </w:r>
+      <w:r>
+        <w:t xml:space="preserve"> </w:t>
+      </w:r>
+      <w:r>
+        <w:t xml:space="preserve">  </w:t>
+      </w:r>
+      <w:r>
+        <w:t xml:space="preserve"> </w:t>
+      </w:r>
+      <w:r>
+        <w:t>Demand Variability and Load Clustering</w:t>
+      </w:r>
+      <w:bookmarkEnd w:id="5"/>
+    </w:p>
+    <w:p>
+      <w:pPr>
+        <w:rPr>
+          <w:b/>
+          <w:bCs/>
+        </w:rPr>
+      </w:pPr>
+      <w:r>
+        <w:rPr>
+          <w:b/>
+          <w:bCs/>
+        </w:rPr>
+        <w:t>5.1.</w:t>
+      </w:r>
+      <w:r>
+        <w:rPr>
+          <w:b/>
+          <w:bCs/>
+        </w:rPr>
+        <w:t xml:space="preserve"> </w:t>
+      </w:r>
+      <w:r>
+        <w:rPr>
+          <w:b/>
+          <w:bCs/>
+        </w:rPr>
+        <w:t>Context and Scope of the Domain</w:t>
+      </w:r>
+    </w:p>
+    <w:p>
+      <w:r>
+        <w:t xml:space="preserve">Demand-side dynamics play a crucial role in assessing the operational stress experienced by </w:t>
+      </w:r>
+      <w:r>
+        <w:t>electricity</w:t>
+      </w:r>
+      <w:r>
+        <w:t xml:space="preserve"> zones. Variability in energy consumption</w:t>
+      </w:r>
+      <w:r>
+        <w:t xml:space="preserve"> </w:t>
+      </w:r>
+      <w:r>
+        <w:t>both within a day and across multiple days</w:t>
+      </w:r>
+      <w:r>
+        <w:t xml:space="preserve"> </w:t>
+      </w:r>
+      <w:r>
+        <w:t>can increase the complexity of dispatch decisions, elevate the risk of congestion, and reduce the efficiency of generation scheduling. As such, understanding patterns of demand fluctuation is fundamental to evaluating the readiness of a zone to accommodate smart grid technologies that rely on load predictability and responsiveness.</w:t>
+      </w:r>
+    </w:p>
+    <w:p>
+      <w:r>
+        <w:t>In recent years, the availability of granular smart meter data has enabled advanced load analytics at zonal and customer levels. Researchers have applied clustering, time series decomposition, and dimensionality reduction techniques to classify load profiles and identify volatile or peaky patterns. These techniques help isolate zones where traditional supply-following strategies may no longer be sufficient, thereby informing infrastructure upgrades and adaptive control strategies central to smart grid deployment.</w:t>
+      </w:r>
+    </w:p>
+    <w:p/>
+    <w:p>
+      <w:pPr>
+        <w:rPr>
+          <w:b/>
+          <w:bCs/>
+        </w:rPr>
+      </w:pPr>
+      <w:r>
+        <w:rPr>
+          <w:b/>
+          <w:bCs/>
+        </w:rPr>
+        <w:lastRenderedPageBreak/>
+        <w:t>5.2.</w:t>
+      </w:r>
+      <w:r>
+        <w:rPr>
+          <w:b/>
+          <w:bCs/>
+        </w:rPr>
+        <w:t xml:space="preserve"> </w:t>
+      </w:r>
+      <w:r>
+        <w:rPr>
+          <w:b/>
+          <w:bCs/>
+        </w:rPr>
+        <w:t>Representative Literature in the Domain</w:t>
+      </w:r>
+    </w:p>
+    <w:p>
+      <w:r>
+        <w:t>1.</w:t>
+      </w:r>
+      <w:r>
+        <w:t xml:space="preserve"> </w:t>
+      </w:r>
+      <w:r>
+        <w:t xml:space="preserve">J. </w:t>
+      </w:r>
+      <w:proofErr w:type="spellStart"/>
+      <w:r>
+        <w:t>Kwac</w:t>
+      </w:r>
+      <w:proofErr w:type="spellEnd"/>
+      <w:r>
+        <w:t>, J. Flora, and R. Rajagopal, “Household load pattern clustering using smart meter data,” ACM SIGKDD Explorations Newsletter, vol. 15, no. 2, pp. 56–65, 2014.</w:t>
+      </w:r>
+    </w:p>
+    <w:p>
+      <w:r>
+        <w:t>2.</w:t>
+      </w:r>
+      <w:r>
+        <w:t xml:space="preserve"> </w:t>
+      </w:r>
+      <w:r>
+        <w:t xml:space="preserve">M. </w:t>
+      </w:r>
+      <w:proofErr w:type="spellStart"/>
+      <w:r>
+        <w:t>Qadrdan</w:t>
+      </w:r>
+      <w:proofErr w:type="spellEnd"/>
+      <w:r>
+        <w:t>, M. Chaudry, J. Wu, and N. Jenkins, “Load aggregation and response strategies for demand side management,” Energy, vol. 71, pp. 441–449, 2014.</w:t>
+      </w:r>
+    </w:p>
+    <w:p>
+      <w:r>
+        <w:t>3.</w:t>
+      </w:r>
+      <w:r>
+        <w:t xml:space="preserve"> </w:t>
+      </w:r>
+      <w:r>
+        <w:t xml:space="preserve">M. Jamei, K. Mylonas, and R. </w:t>
+      </w:r>
+      <w:proofErr w:type="spellStart"/>
+      <w:r>
+        <w:t>Tindemans</w:t>
+      </w:r>
+      <w:proofErr w:type="spellEnd"/>
+      <w:r>
+        <w:t>, “Electricity demand forecasting at local level using clustering and PAA,” Energy and Built Environment, vol. 1, no. 2, pp. 178–186, 2020.</w:t>
+      </w:r>
+    </w:p>
+    <w:p>
+      <w:r>
+        <w:t>4.</w:t>
+      </w:r>
+      <w:r>
+        <w:t xml:space="preserve"> </w:t>
+      </w:r>
+      <w:r>
+        <w:t>G.B. Gaggero et al., “A Possible Smart Metering System Evolution for Rural and Remote Areas Employing UAVs and IoT in Smart Grids,” Sensors, vol. 21, no. 5, 2021.</w:t>
+      </w:r>
+    </w:p>
+    <w:p>
+      <w:r>
+        <w:t>5.</w:t>
+      </w:r>
+      <w:r>
+        <w:t xml:space="preserve"> </w:t>
+      </w:r>
+      <w:r>
+        <w:t>M. Roozbehani, M.A. Dahleh, and S.K. Mitter, “Volatility of Power Grids Under Real-Time Pricing,” IEEE Trans. Power Syst., vol. 27, no. 4, pp. 1926–1937, 2012.</w:t>
+      </w:r>
+    </w:p>
+    <w:p/>
+    <w:p>
+      <w:pPr>
+        <w:rPr>
+          <w:b/>
+          <w:bCs/>
+        </w:rPr>
+      </w:pPr>
+      <w:r>
+        <w:rPr>
+          <w:b/>
+          <w:bCs/>
+        </w:rPr>
+        <w:t>5.3.</w:t>
+      </w:r>
+      <w:r>
+        <w:rPr>
+          <w:b/>
+          <w:bCs/>
+        </w:rPr>
+        <w:t xml:space="preserve"> </w:t>
+      </w:r>
+      <w:r>
+        <w:rPr>
+          <w:b/>
+          <w:bCs/>
+        </w:rPr>
+        <w:t>Comparative Analysis and Thematic Insights</w:t>
+      </w:r>
+    </w:p>
+    <w:p>
+      <w:proofErr w:type="spellStart"/>
+      <w:r>
+        <w:t>Kwac</w:t>
+      </w:r>
+      <w:proofErr w:type="spellEnd"/>
+      <w:r>
+        <w:t xml:space="preserve"> et al. [6] demonstrate the use of k-means clustering on smart meter data to identify households with similar consumption profiles, revealing that demand diversity can significantly affect system- level planning. Their approach serves as a foundation for identifying zones with erratic or highly synchronized demand, which may pose risks under demand-side management programs.</w:t>
+      </w:r>
+    </w:p>
+    <w:p>
+      <w:r>
+        <w:t>Jamei et al. [8] introduce a lightweight demand forecasting method using Piecewise Aggregate Approximation (PAA) and symbolic approximation to reduce data dimensionality. Their work shows how local demand profiles can be effectively compressed and forecasted even in the absence of real-time updates</w:t>
+      </w:r>
+      <w:r>
+        <w:t xml:space="preserve"> </w:t>
+      </w:r>
+      <w:r>
+        <w:t>an insight particularly useful for evaluating readiness in under-instrumented zones.</w:t>
+      </w:r>
+    </w:p>
+    <w:p>
+      <w:r>
+        <w:t xml:space="preserve">Gaggero et al. [5] propose a metering architecture suitable for rural and remote areas where real-time data is unavailable. This architecture could enhance demand observability and support clustering in data-scarce Ontario zones. Meanwhile, </w:t>
+      </w:r>
+      <w:proofErr w:type="spellStart"/>
+      <w:r>
+        <w:t>Qadrdan</w:t>
+      </w:r>
+      <w:proofErr w:type="spellEnd"/>
+      <w:r>
+        <w:t xml:space="preserve"> et al. [7] emphasize how aggregated load profiles can support peak shaving and load shifting strategies, which are central to enabling smart grid responsiveness.</w:t>
+      </w:r>
+    </w:p>
+    <w:p/>
+    <w:p>
+      <w:pPr>
+        <w:rPr>
+          <w:b/>
+          <w:bCs/>
+        </w:rPr>
+      </w:pPr>
+      <w:r>
+        <w:rPr>
+          <w:b/>
+          <w:bCs/>
+        </w:rPr>
+        <w:t>5.4.</w:t>
+      </w:r>
+      <w:r>
+        <w:rPr>
+          <w:b/>
+          <w:bCs/>
+        </w:rPr>
+        <w:t xml:space="preserve"> </w:t>
+      </w:r>
+      <w:r>
+        <w:rPr>
+          <w:b/>
+          <w:bCs/>
+        </w:rPr>
+        <w:t>Experimental Relevance and Data Application Strategy</w:t>
+      </w:r>
+    </w:p>
+    <w:p>
+      <w:r>
+        <w:t>To quantify demand-related stress and variability in Ontario’s zones, the following experiments are proposed: To quantify demand-related stress and variability in Ontario’s zones, the following experiments are proposed using the available IESO datasets:</w:t>
+      </w:r>
+    </w:p>
+    <w:p>
+      <w:pPr>
+        <w:rPr>
+          <w:b/>
+          <w:bCs/>
+        </w:rPr>
+      </w:pPr>
+      <w:r>
+        <w:rPr>
+          <w:b/>
+          <w:bCs/>
+        </w:rPr>
+        <w:lastRenderedPageBreak/>
+        <w:t xml:space="preserve">Experiment </w:t>
+      </w:r>
+      <w:r>
+        <w:rPr>
+          <w:b/>
+          <w:bCs/>
+        </w:rPr>
+        <w:t>4</w:t>
+      </w:r>
+      <w:r>
+        <w:rPr>
+          <w:b/>
+          <w:bCs/>
+        </w:rPr>
+        <w:t>: Intra-Day and Inter-Day Demand Variability Assessment</w:t>
+      </w:r>
+    </w:p>
+    <w:p>
+      <w:r>
+        <w:t>•</w:t>
+      </w:r>
+      <w:r>
+        <w:t xml:space="preserve"> </w:t>
+      </w:r>
+      <w:r>
+        <w:t>Inputs: Dataset 1 (Real Time Zonal Demand)</w:t>
+      </w:r>
+    </w:p>
+    <w:p>
+      <w:r>
+        <w:t>•</w:t>
+      </w:r>
+      <w:r>
+        <w:t xml:space="preserve"> </w:t>
+      </w:r>
+      <w:r>
         <w:t>Processing Objective: Compute coefficient of variation (CV) at both hourly and daily aggregation levels for each zone.</w:t>
       </w:r>
     </w:p>
@@ -2558,7 +2794,21 @@
           <w:b/>
           <w:bCs/>
         </w:rPr>
-        <w:t>Experiment 2: Temporal Load Clustering</w:t>
+        <w:t xml:space="preserve">Experiment </w:t>
+      </w:r>
+      <w:r>
+        <w:rPr>
+          <w:b/>
+          <w:bCs/>
+        </w:rPr>
+        <w:t>5</w:t>
+      </w:r>
+      <w:r>
+        <w:rPr>
+          <w:b/>
+          <w:bCs/>
+        </w:rPr>
+        <w:t>: Temporal Load Clustering</w:t>
       </w:r>
     </w:p>
     <w:p>
@@ -2606,7 +2856,21 @@
           <w:b/>
           <w:bCs/>
         </w:rPr>
-        <w:t>Experiment 3: Demand Forecast Error Analysis</w:t>
+        <w:t xml:space="preserve">Experiment </w:t>
+      </w:r>
+      <w:r>
+        <w:rPr>
+          <w:b/>
+          <w:bCs/>
+        </w:rPr>
+        <w:t>6</w:t>
+      </w:r>
+      <w:r>
+        <w:rPr>
+          <w:b/>
+          <w:bCs/>
+        </w:rPr>
+        <w:t>: Demand Forecast Error Analysis</w:t>
       </w:r>
     </w:p>
     <w:p>
@@ -2686,7 +2950,7 @@
       <w:pPr>
         <w:pStyle w:val="Heading1"/>
       </w:pPr>
-      <w:bookmarkStart w:id="6" w:name="_Toc201619682"/>
+      <w:bookmarkStart w:id="6" w:name="_Toc202469747"/>
       <w:r>
         <w:lastRenderedPageBreak/>
         <w:t>6.</w:t>
@@ -2695,6 +2959,9 @@
         <w:t xml:space="preserve"> </w:t>
       </w:r>
       <w:r>
+        <w:t xml:space="preserve">   </w:t>
+      </w:r>
+      <w:r>
         <w:t>Price Volatility and Dispatch Deviation</w:t>
       </w:r>
       <w:bookmarkEnd w:id="6"/>
@@ -2787,7 +3054,15 @@
         <w:t xml:space="preserve"> </w:t>
       </w:r>
       <w:r>
-        <w:t>R. Weron, “Electricity price forecasting: A review of the state-of-the-art with a look into the future,” International Journal of Forecasting, vol. 30, no. 4, pp. 1030–1081, 2014.</w:t>
+        <w:t xml:space="preserve">R. </w:t>
+      </w:r>
+      <w:proofErr w:type="spellStart"/>
+      <w:r>
+        <w:t>Weron</w:t>
+      </w:r>
+      <w:proofErr w:type="spellEnd"/>
+      <w:r>
+        <w:t>, “Electricity price forecasting: A review of the state-of-the-art with a look into the future,” International Journal of Forecasting, vol. 30, no. 4, pp. 1030–1081, 2014.</w:t>
       </w:r>
     </w:p>
     <w:p>
@@ -2798,7 +3073,15 @@
         <w:t xml:space="preserve"> </w:t>
       </w:r>
       <w:r>
-        <w:t xml:space="preserve">S. Bahramirad, W. Reder, and A. Khodaei, “Reliability-Constrained Optimal Sizing of Energy Storage System in a Microgrid,” IEEE Transactions on Smart Grid, vol. 3, no. 4, pp. 2056–2062, 2012. </w:t>
+        <w:t xml:space="preserve">S. </w:t>
+      </w:r>
+      <w:proofErr w:type="spellStart"/>
+      <w:r>
+        <w:t>Bahramirad</w:t>
+      </w:r>
+      <w:proofErr w:type="spellEnd"/>
+      <w:r>
+        <w:t xml:space="preserve">, W. Reder, and A. Khodaei, “Reliability-Constrained Optimal Sizing of Energy Storage System in a Microgrid,” IEEE Transactions on Smart Grid, vol. 3, no. 4, pp. 2056–2062, 2012. </w:t>
       </w:r>
     </w:p>
     <w:p>
@@ -2856,12 +3139,28 @@
     <w:p>
       <w:r>
         <w:lastRenderedPageBreak/>
-        <w:t>Mohamed et al. [10] present planning strategies for energy storage systems in day-ahead markets under price uncertainty. Using stochastic optimization and scenario-based forecasting, their study demonstrates how forecast errors propagate through bidding outcomes, making this approach highly relevant for zones where dispatch mismatches are frequent. Weron’s comprehensive review [11] further contextualizes electricity price forecasting challenges, categorizing methods into statistical, machine learning, and hybrid frameworks.</w:t>
-      </w:r>
-    </w:p>
-    <w:p>
-      <w:r>
-        <w:t>Roozbehani et al. [9] provide a theoretical lens for analyzing volatility as a feedback control issue, showing how the interplay of demand elasticity and price responsiveness can cause instability. Their model demonstrates that zones with high demand response potential but poor control coordination are particularly vulnerable to price-induced oscillations. Bahramirad et al. [12] support this view by highlighting the role of reliability constraints in optimal dispatch and the consequences of demand misalignment.</w:t>
+        <w:t xml:space="preserve">Mohamed et al. [10] present planning strategies for energy storage systems in day-ahead markets under price uncertainty. Using stochastic optimization and scenario-based forecasting, their study demonstrates how forecast errors propagate through bidding outcomes, making this approach highly relevant for zones where dispatch mismatches are frequent. </w:t>
+      </w:r>
+      <w:proofErr w:type="spellStart"/>
+      <w:r>
+        <w:t>Weron’s</w:t>
+      </w:r>
+      <w:proofErr w:type="spellEnd"/>
+      <w:r>
+        <w:t xml:space="preserve"> comprehensive review [11] further contextualizes electricity price forecasting challenges, categorizing methods into statistical, machine learning, and hybrid frameworks.</w:t>
+      </w:r>
+    </w:p>
+    <w:p>
+      <w:r>
+        <w:t xml:space="preserve">Roozbehani et al. [9] provide a theoretical lens for analyzing volatility as a feedback control issue, showing how the interplay of demand elasticity and price responsiveness can cause instability. Their model demonstrates that zones with high demand response potential but poor control coordination are particularly vulnerable to price-induced oscillations. </w:t>
+      </w:r>
+      <w:proofErr w:type="spellStart"/>
+      <w:r>
+        <w:t>Bahramirad</w:t>
+      </w:r>
+      <w:proofErr w:type="spellEnd"/>
+      <w:r>
+        <w:t xml:space="preserve"> et al. [12] support this view by highlighting the role of reliability constraints in optimal dispatch and the consequences of demand misalignment.</w:t>
       </w:r>
     </w:p>
     <w:p>
@@ -2901,7 +3200,23 @@
     </w:p>
     <w:p>
       <w:r>
-        <w:t>Based on the reviewed literature and Ontario’s zonal data infrastructure, the following experi- ments are proposed: Based on the reviewed literature and Ontario’s zonal data infrastructure, the following experiments are proposed using only the described IESO datasets:</w:t>
+        <w:t xml:space="preserve">Based on the reviewed literature and Ontario’s zonal data infrastructure, the following </w:t>
+      </w:r>
+      <w:proofErr w:type="spellStart"/>
+      <w:r>
+        <w:t>experi</w:t>
+      </w:r>
+      <w:proofErr w:type="spellEnd"/>
+      <w:r>
+        <w:t xml:space="preserve">- </w:t>
+      </w:r>
+      <w:proofErr w:type="spellStart"/>
+      <w:r>
+        <w:t>ments</w:t>
+      </w:r>
+      <w:proofErr w:type="spellEnd"/>
+      <w:r>
+        <w:t xml:space="preserve"> are proposed: Based on the reviewed literature and Ontario’s zonal data infrastructure, the following experiments are proposed using only the described IESO datasets:</w:t>
       </w:r>
     </w:p>
     <w:p>
@@ -2986,7 +3301,15 @@
         <w:t xml:space="preserve"> </w:t>
       </w:r>
       <w:r>
-        <w:t>Processing Objective: Aggregate and classify dispatch deviations by frequency and mag- nitude per zone.</w:t>
+        <w:t xml:space="preserve">Processing Objective: Aggregate and classify dispatch deviations by frequency and mag- </w:t>
+      </w:r>
+      <w:proofErr w:type="spellStart"/>
+      <w:r>
+        <w:t>nitude</w:t>
+      </w:r>
+      <w:proofErr w:type="spellEnd"/>
+      <w:r>
+        <w:t xml:space="preserve"> per zone.</w:t>
       </w:r>
     </w:p>
     <w:p>
@@ -3094,9 +3417,15 @@
       <w:pPr>
         <w:pStyle w:val="Heading1"/>
       </w:pPr>
-      <w:bookmarkStart w:id="7" w:name="_Toc201619683"/>
+      <w:bookmarkStart w:id="7" w:name="_Toc202469748"/>
       <w:r>
         <w:t>7.</w:t>
+      </w:r>
+      <w:r>
+        <w:t xml:space="preserve"> </w:t>
+      </w:r>
+      <w:r>
+        <w:t xml:space="preserve">  </w:t>
       </w:r>
       <w:r>
         <w:t xml:space="preserve"> </w:t>
@@ -3360,6 +3689,12 @@
       <w:r>
         <w:t>Inputs: Dataset 4 (Transmission Outages)</w:t>
       </w:r>
+      <w:r>
+        <w:t xml:space="preserve"> and </w:t>
+      </w:r>
+      <w:r>
+        <w:t>Dataset 1 (Real Time Zonal Demand)</w:t>
+      </w:r>
     </w:p>
     <w:p>
       <w:r>
@@ -3528,7 +3863,7 @@
       <w:pPr>
         <w:pStyle w:val="Heading1"/>
       </w:pPr>
-      <w:bookmarkStart w:id="8" w:name="_Toc201619684"/>
+      <w:bookmarkStart w:id="8" w:name="_Toc202469749"/>
       <w:r>
         <w:t>8.</w:t>
       </w:r>
@@ -3536,6 +3871,12 @@
         <w:t xml:space="preserve"> </w:t>
       </w:r>
       <w:r>
+        <w:t xml:space="preserve">  </w:t>
+      </w:r>
+      <w:r>
+        <w:t xml:space="preserve"> </w:t>
+      </w:r>
+      <w:r>
         <w:t>Cross-Cutting Methodologies and Enabling Technologies</w:t>
       </w:r>
       <w:bookmarkEnd w:id="8"/>
@@ -3576,7 +3917,31 @@
     </w:p>
     <w:p>
       <w:r>
-        <w:t>As electricity systems become increasingly complex and cyber-physical in nature, data model- ing, real-time control, and distributed intelligence are no longer auxiliary features but fundamental requirements. These enabling technologies support all layers of smart grid functionality—from predictive maintenance and anomaly detection to decentralized dispatch and adaptive load shap- ing. This domain surveys literature that provides tools and frameworks applicable across multiple components of the Smart Grid Readiness Index (SGRI).</w:t>
+        <w:t xml:space="preserve">As electricity systems become increasingly complex and cyber-physical in nature, data model- </w:t>
+      </w:r>
+      <w:proofErr w:type="spellStart"/>
+      <w:r>
+        <w:t>ing</w:t>
+      </w:r>
+      <w:proofErr w:type="spellEnd"/>
+      <w:r>
+        <w:t xml:space="preserve">, real-time control, and distributed intelligence are no longer auxiliary features but fundamental requirements. These enabling technologies support all layers of smart grid functionality—from predictive maintenance and anomaly detection to decentralized dispatch and adaptive load </w:t>
+      </w:r>
+      <w:proofErr w:type="spellStart"/>
+      <w:r>
+        <w:t>shap</w:t>
+      </w:r>
+      <w:proofErr w:type="spellEnd"/>
+      <w:r>
+        <w:t xml:space="preserve">- </w:t>
+      </w:r>
+      <w:proofErr w:type="spellStart"/>
+      <w:r>
+        <w:t>ing</w:t>
+      </w:r>
+      <w:proofErr w:type="spellEnd"/>
+      <w:r>
+        <w:t>. This domain surveys literature that provides tools and frameworks applicable across multiple components of the Smart Grid Readiness Index (SGRI).</w:t>
       </w:r>
     </w:p>
     <w:p/>
@@ -3617,7 +3982,15 @@
         <w:t xml:space="preserve"> </w:t>
       </w:r>
       <w:r>
-        <w:t>M.R. Hesami, A. Safari, and R. Fadaeenejad, “Data-driven probabilistic machine learning in smart grid systems: A review,” Renewable and Sustainable Energy Reviews, vol. 158, 2022.</w:t>
+        <w:t xml:space="preserve">M.R. Hesami, A. Safari, and R. </w:t>
+      </w:r>
+      <w:proofErr w:type="spellStart"/>
+      <w:r>
+        <w:t>Fadaeenejad</w:t>
+      </w:r>
+      <w:proofErr w:type="spellEnd"/>
+      <w:r>
+        <w:t>, “Data-driven probabilistic machine learning in smart grid systems: A review,” Renewable and Sustainable Energy Reviews, vol. 158, 2022.</w:t>
       </w:r>
     </w:p>
     <w:p>
@@ -3639,7 +4012,15 @@
         <w:t xml:space="preserve"> </w:t>
       </w:r>
       <w:r>
-        <w:t>C. Chen et al., “Cybersecurity and Electrical Power Systems: Emerging Threats and Miti- gation Strategies,” IEEE Transactions on Smart Grid, vol. 11, no. 3, pp. 2204–2213, 2020.</w:t>
+        <w:t xml:space="preserve">C. Chen et al., “Cybersecurity and Electrical Power Systems: Emerging Threats and Miti- </w:t>
+      </w:r>
+      <w:proofErr w:type="spellStart"/>
+      <w:r>
+        <w:t>gation</w:t>
+      </w:r>
+      <w:proofErr w:type="spellEnd"/>
+      <w:r>
+        <w:t xml:space="preserve"> Strategies,” IEEE Transactions on Smart Grid, vol. 11, no. 3, pp. 2204–2213, 2020.</w:t>
       </w:r>
     </w:p>
     <w:p>
@@ -3949,7 +4330,7 @@
       <w:pPr>
         <w:pStyle w:val="Heading1"/>
       </w:pPr>
-      <w:bookmarkStart w:id="9" w:name="_Toc201619685"/>
+      <w:bookmarkStart w:id="9" w:name="_Toc202469750"/>
       <w:r>
         <w:t>9.</w:t>
       </w:r>
@@ -3957,6 +4338,12 @@
         <w:t xml:space="preserve"> </w:t>
       </w:r>
       <w:r>
+        <w:t xml:space="preserve">  </w:t>
+      </w:r>
+      <w:r>
+        <w:t xml:space="preserve"> </w:t>
+      </w:r>
+      <w:r>
         <w:t>Data Description</w:t>
       </w:r>
       <w:bookmarkEnd w:id="9"/>
@@ -4101,7 +4488,15 @@
     </w:p>
     <w:p>
       <w:r>
-        <w:t>- Missing values were addressed using forward fill (`ffill`) and interpolation techniques.</w:t>
+        <w:t>- Missing values were addressed using forward fill (`</w:t>
+      </w:r>
+      <w:proofErr w:type="spellStart"/>
+      <w:r>
+        <w:t>ffill</w:t>
+      </w:r>
+      <w:proofErr w:type="spellEnd"/>
+      <w:r>
+        <w:t>`) and interpolation techniques.</w:t>
       </w:r>
     </w:p>
     <w:p>
@@ -4132,7 +4527,7 @@
       <w:pPr>
         <w:pStyle w:val="Heading1"/>
       </w:pPr>
-      <w:bookmarkStart w:id="10" w:name="_Toc201619686"/>
+      <w:bookmarkStart w:id="10" w:name="_Toc202469751"/>
       <w:r>
         <w:lastRenderedPageBreak/>
         <w:t>10.</w:t>
@@ -4141,6 +4536,9 @@
         <w:t xml:space="preserve"> </w:t>
       </w:r>
       <w:r>
+        <w:t xml:space="preserve"> </w:t>
+      </w:r>
+      <w:r>
         <w:t>Literature Summary</w:t>
       </w:r>
       <w:bookmarkEnd w:id="10"/>
@@ -4168,7 +4566,15 @@
         <w:t>d</w:t>
       </w:r>
       <w:r>
-        <w:t xml:space="preserve"> ological support for quantifying operational risk associated with unstable or misaligned market signals.</w:t>
+        <w:t xml:space="preserve"> </w:t>
+      </w:r>
+      <w:proofErr w:type="spellStart"/>
+      <w:r>
+        <w:t>ological</w:t>
+      </w:r>
+      <w:proofErr w:type="spellEnd"/>
+      <w:r>
+        <w:t xml:space="preserve"> support for quantifying operational risk associated with unstable or misaligned market signals.</w:t>
       </w:r>
     </w:p>
     <w:p>
@@ -4184,7 +4590,15 @@
         <w:t>-</w:t>
       </w:r>
       <w:r>
-        <w:t xml:space="preserve"> eling, anomaly detection, and cyber-physical system integration ensure that the SGRI accounts for modern digital infrastructure challenges.</w:t>
+        <w:t xml:space="preserve"> </w:t>
+      </w:r>
+      <w:proofErr w:type="spellStart"/>
+      <w:r>
+        <w:t>eling</w:t>
+      </w:r>
+      <w:proofErr w:type="spellEnd"/>
+      <w:r>
+        <w:t>, anomaly detection, and cyber-physical system integration ensure that the SGRI accounts for modern digital infrastructure challenges.</w:t>
       </w:r>
     </w:p>
     <w:p>
@@ -4201,12 +4615,15 @@
       <w:pPr>
         <w:pStyle w:val="Heading1"/>
       </w:pPr>
-      <w:bookmarkStart w:id="11" w:name="_Toc201619687"/>
+      <w:bookmarkStart w:id="11" w:name="_Toc202469752"/>
       <w:r>
         <w:t>11.</w:t>
       </w:r>
       <w:r>
         <w:t xml:space="preserve"> </w:t>
+      </w:r>
+      <w:r>
+        <w:t xml:space="preserve">  </w:t>
       </w:r>
       <w:r>
         <w:t>Precautions and Limitations</w:t>
@@ -4257,12 +4674,17 @@
       <w:pPr>
         <w:pStyle w:val="Heading1"/>
       </w:pPr>
-      <w:bookmarkStart w:id="12" w:name="_Toc201619688"/>
+      <w:bookmarkStart w:id="12" w:name="_Toc202469753"/>
       <w:r>
         <w:t>12.</w:t>
       </w:r>
       <w:r>
-        <w:tab/>
+        <w:t xml:space="preserve"> </w:t>
+      </w:r>
+      <w:r>
+        <w:t xml:space="preserve"> </w:t>
+      </w:r>
+      <w:r>
         <w:t>Significance and Future Work</w:t>
       </w:r>
       <w:bookmarkEnd w:id="12"/>
@@ -4316,7 +4738,15 @@
         <w:t xml:space="preserve"> </w:t>
       </w:r>
       <w:r>
-        <w:t>The framework supports data-informed policymaking, enabling regulators, utilities, and plan- ners to prioritize grid upgrades in a manner aligned with operational realities and strategic energy goals.</w:t>
+        <w:t xml:space="preserve">The framework supports data-informed policymaking, enabling regulators, utilities, and plan- </w:t>
+      </w:r>
+      <w:proofErr w:type="spellStart"/>
+      <w:r>
+        <w:t>ners</w:t>
+      </w:r>
+      <w:proofErr w:type="spellEnd"/>
+      <w:r>
+        <w:t xml:space="preserve"> to prioritize grid upgrades in a manner aligned with operational realities and strategic energy goals.</w:t>
       </w:r>
     </w:p>
     <w:p>
@@ -4332,7 +4762,15 @@
     </w:p>
     <w:p>
       <w:r>
-        <w:t>Future Work: This initial formulation of the SGRI opens multiple avenues for future enhance- ment:</w:t>
+        <w:t xml:space="preserve">Future Work: This initial formulation of the SGRI opens multiple avenues for future enhance- </w:t>
+      </w:r>
+      <w:proofErr w:type="spellStart"/>
+      <w:r>
+        <w:t>ment</w:t>
+      </w:r>
+      <w:proofErr w:type="spellEnd"/>
+      <w:r>
+        <w:t>:</w:t>
       </w:r>
     </w:p>
     <w:p>
@@ -4343,7 +4781,15 @@
         <w:t xml:space="preserve"> </w:t>
       </w:r>
       <w:r>
-        <w:t>Temporal Expansion: Applying the framework across multiple years to detect readiness evo- lution and investment impact over time.</w:t>
+        <w:t xml:space="preserve">Temporal Expansion: Applying the framework across multiple years to detect readiness evo- </w:t>
+      </w:r>
+      <w:proofErr w:type="spellStart"/>
+      <w:r>
+        <w:t>lution</w:t>
+      </w:r>
+      <w:proofErr w:type="spellEnd"/>
+      <w:r>
+        <w:t xml:space="preserve"> and investment impact over time.</w:t>
       </w:r>
     </w:p>
     <w:p>
@@ -4400,7 +4846,13 @@
       <w:pPr>
         <w:pStyle w:val="Heading1"/>
       </w:pPr>
-      <w:bookmarkStart w:id="13" w:name="_Toc201619689"/>
+      <w:bookmarkStart w:id="13" w:name="_Toc202469754"/>
+      <w:r>
+        <w:t xml:space="preserve">13. </w:t>
+      </w:r>
+      <w:r>
+        <w:t xml:space="preserve">   </w:t>
+      </w:r>
       <w:r>
         <w:t>References</w:t>
       </w:r>
@@ -4436,7 +4888,15 @@
         <w:t xml:space="preserve"> </w:t>
       </w:r>
       <w:r>
-        <w:t>M. Cinelli, P. P. Trucco, A. L. Massimo, and F. Cagnoni, “Multicriteria Support for the Evaluation of Electricity Supply,” Renewable and Sustainable Energy Reviews, vol. 157, 2022.</w:t>
+        <w:t xml:space="preserve">M. Cinelli, P. P. Trucco, A. L. Massimo, and F. </w:t>
+      </w:r>
+      <w:proofErr w:type="spellStart"/>
+      <w:r>
+        <w:t>Cagnoni</w:t>
+      </w:r>
+      <w:proofErr w:type="spellEnd"/>
+      <w:r>
+        <w:t>, “Multicriteria Support for the Evaluation of Electricity Supply,” Renewable and Sustainable Energy Reviews, vol. 157, 2022.</w:t>
       </w:r>
     </w:p>
     <w:p>
@@ -4447,7 +4907,23 @@
         <w:t xml:space="preserve"> </w:t>
       </w:r>
       <w:r>
-        <w:t>M.G.M. Almihat and J.L. Munda, “The Role of Smart Grid Technologies in Urban and Sus- tainable Energy Planning,” Energies, vol. 18, 2025, Art. no. 1618.</w:t>
+        <w:t xml:space="preserve">M.G.M. </w:t>
+      </w:r>
+      <w:proofErr w:type="spellStart"/>
+      <w:r>
+        <w:t>Almihat</w:t>
+      </w:r>
+      <w:proofErr w:type="spellEnd"/>
+      <w:r>
+        <w:t xml:space="preserve"> and J.L. Munda, “The Role of Smart Grid Technologies in Urban and Sus- </w:t>
+      </w:r>
+      <w:proofErr w:type="spellStart"/>
+      <w:r>
+        <w:t>tainable</w:t>
+      </w:r>
+      <w:proofErr w:type="spellEnd"/>
+      <w:r>
+        <w:t xml:space="preserve"> Energy Planning,” Energies, vol. 18, 2025, Art. no. 1618.</w:t>
       </w:r>
     </w:p>
     <w:p>
@@ -4469,7 +4945,15 @@
         <w:t xml:space="preserve"> </w:t>
       </w:r>
       <w:r>
-        <w:t>J. Kwac, J. Flora, and R. Rajagopal, “Household load pattern clustering using smart meter data,” ACM SIGKDD Explorations Newsletter, vol. 15, no. 2, pp. 56–65, 2014.</w:t>
+        <w:t xml:space="preserve">J. </w:t>
+      </w:r>
+      <w:proofErr w:type="spellStart"/>
+      <w:r>
+        <w:t>Kwac</w:t>
+      </w:r>
+      <w:proofErr w:type="spellEnd"/>
+      <w:r>
+        <w:t>, J. Flora, and R. Rajagopal, “Household load pattern clustering using smart meter data,” ACM SIGKDD Explorations Newsletter, vol. 15, no. 2, pp. 56–65, 2014.</w:t>
       </w:r>
     </w:p>
     <w:p>
@@ -4480,7 +4964,15 @@
         <w:t xml:space="preserve"> </w:t>
       </w:r>
       <w:r>
-        <w:t>M. Qadrdan, M. Chaudry, J. Wu, and N. Jenkins, “Load aggregation and response strategies for demand side management,” Energy, vol. 71, pp. 441–449, 2014.</w:t>
+        <w:t xml:space="preserve">M. </w:t>
+      </w:r>
+      <w:proofErr w:type="spellStart"/>
+      <w:r>
+        <w:t>Qadrdan</w:t>
+      </w:r>
+      <w:proofErr w:type="spellEnd"/>
+      <w:r>
+        <w:t>, M. Chaudry, J. Wu, and N. Jenkins, “Load aggregation and response strategies for demand side management,” Energy, vol. 71, pp. 441–449, 2014.</w:t>
       </w:r>
     </w:p>
     <w:p>
@@ -4491,7 +4983,15 @@
         <w:t xml:space="preserve"> </w:t>
       </w:r>
       <w:r>
-        <w:t>M. Jamei, K. Mylonas, and R. Tindemans, “Electricity demand forecasting at local level using clustering and PAA,” Energy and Built Environment, vol. 1, no. 2, pp. 178–186, 2020.</w:t>
+        <w:t xml:space="preserve">M. Jamei, K. Mylonas, and R. </w:t>
+      </w:r>
+      <w:proofErr w:type="spellStart"/>
+      <w:r>
+        <w:t>Tindemans</w:t>
+      </w:r>
+      <w:proofErr w:type="spellEnd"/>
+      <w:r>
+        <w:t>, “Electricity demand forecasting at local level using clustering and PAA,” Energy and Built Environment, vol. 1, no. 2, pp. 178–186, 2020.</w:t>
       </w:r>
     </w:p>
     <w:p>
@@ -4513,7 +5013,15 @@
         <w:t xml:space="preserve"> </w:t>
       </w:r>
       <w:r>
-        <w:t>A. Mohamed, H. Ibrahim, M. S. Balli, and S. Mekhilef, “Operational Planning Strategies to Mitigate Price Uncertainty in Day-Ahead Market for a Battery Energy System,” IEEE Access, vol. 12, pp. 58292–58306, 2024.</w:t>
+        <w:t xml:space="preserve">A. Mohamed, H. Ibrahim, M. S. Balli, and S. </w:t>
+      </w:r>
+      <w:proofErr w:type="spellStart"/>
+      <w:r>
+        <w:t>Mekhilef</w:t>
+      </w:r>
+      <w:proofErr w:type="spellEnd"/>
+      <w:r>
+        <w:t>, “Operational Planning Strategies to Mitigate Price Uncertainty in Day-Ahead Market for a Battery Energy System,” IEEE Access, vol. 12, pp. 58292–58306, 2024.</w:t>
       </w:r>
     </w:p>
     <w:p>
@@ -4524,7 +5032,15 @@
         <w:t xml:space="preserve"> </w:t>
       </w:r>
       <w:r>
-        <w:t>R. Weron, “Electricity price forecasting: A review of the state-of-the-art with a look into the future,” International Journal of Forecasting, vol. 30, no. 4, pp. 1030–1081, 2014.</w:t>
+        <w:t xml:space="preserve">R. </w:t>
+      </w:r>
+      <w:proofErr w:type="spellStart"/>
+      <w:r>
+        <w:t>Weron</w:t>
+      </w:r>
+      <w:proofErr w:type="spellEnd"/>
+      <w:r>
+        <w:t>, “Electricity price forecasting: A review of the state-of-the-art with a look into the future,” International Journal of Forecasting, vol. 30, no. 4, pp. 1030–1081, 2014.</w:t>
       </w:r>
     </w:p>
     <w:p>
@@ -4535,7 +5051,23 @@
         <w:t xml:space="preserve"> </w:t>
       </w:r>
       <w:r>
-        <w:t>S. Bahramirad, W. Reder, and A. Khodaei, “Reliability-Constrained Optimal Sizing of En- ergy Storage System in a Microgrid,” IEEE Transactions on Smart Grid, vol. 3, no. 4, pp. 2056–2062, 2012.</w:t>
+        <w:t xml:space="preserve">S. </w:t>
+      </w:r>
+      <w:proofErr w:type="spellStart"/>
+      <w:r>
+        <w:t>Bahramirad</w:t>
+      </w:r>
+      <w:proofErr w:type="spellEnd"/>
+      <w:r>
+        <w:t xml:space="preserve">, W. Reder, and A. Khodaei, “Reliability-Constrained Optimal Sizing of En- </w:t>
+      </w:r>
+      <w:proofErr w:type="spellStart"/>
+      <w:r>
+        <w:t>ergy</w:t>
+      </w:r>
+      <w:proofErr w:type="spellEnd"/>
+      <w:r>
+        <w:t xml:space="preserve"> Storage System in a Microgrid,” IEEE Transactions on Smart Grid, vol. 3, no. 4, pp. 2056–2062, 2012.</w:t>
       </w:r>
     </w:p>
     <w:p>
@@ -4617,7 +5149,15 @@
         <w:t xml:space="preserve"> </w:t>
       </w:r>
       <w:r>
-        <w:t>M.R. Hesami, A. Safari, and R. Fadaeenejad, “Data-driven probabilistic machine learning in smart grid systems: A review,” Renewable and Sustainable Energy Reviews, vol. 158, 2022.</w:t>
+        <w:t xml:space="preserve">M.R. Hesami, A. Safari, and R. </w:t>
+      </w:r>
+      <w:proofErr w:type="spellStart"/>
+      <w:r>
+        <w:t>Fadaeenejad</w:t>
+      </w:r>
+      <w:proofErr w:type="spellEnd"/>
+      <w:r>
+        <w:t>, “Data-driven probabilistic machine learning in smart grid systems: A review,” Renewable and Sustainable Energy Reviews, vol. 158, 2022.</w:t>
       </w:r>
     </w:p>
     <w:p>
@@ -4672,7 +5212,23 @@
         <w:t xml:space="preserve"> </w:t>
       </w:r>
       <w:r>
-        <w:t>A. Gupta, P. S. Karki, and S. S. Saha, “An Analysis of Zonal Electricity Patterns in Compet- itive Power Markets,” Energy Economics, vol. 72, pp.</w:t>
+        <w:t xml:space="preserve">A. Gupta, P. S. Karki, and S. S. Saha, “An Analysis of Zonal Electricity Patterns in </w:t>
+      </w:r>
+      <w:proofErr w:type="spellStart"/>
+      <w:r>
+        <w:t>Compet</w:t>
+      </w:r>
+      <w:proofErr w:type="spellEnd"/>
+      <w:r>
+        <w:t xml:space="preserve">- </w:t>
+      </w:r>
+      <w:proofErr w:type="spellStart"/>
+      <w:r>
+        <w:t>itive</w:t>
+      </w:r>
+      <w:proofErr w:type="spellEnd"/>
+      <w:r>
+        <w:t xml:space="preserve"> Power Markets,” Energy Economics, vol. 72, pp.</w:t>
       </w:r>
     </w:p>
     <w:p>

</xml_diff>